<commit_message>
style: standardize spacing and fix dark mode in ai dashboard
- Standardize all spacing utilities to default Tailwind scale (eliminate p-3.5, p-4.5, p-2.5, gap-1.5, etc.)

- Fix dark/light mode contrast across hero section, cards, inputs, and tables

- Regenerate binary reports (.docx, .pdf) for Claude, DeepSeek, Gemini, and GPT
</commit_message>
<xml_diff>
--- a/ai/_data/deepseek_rapor.docx
+++ b/ai/_data/deepseek_rapor.docx
@@ -20,7 +20,7 @@
           <w:b/>
           <w:bCs/>
         </w:rPr>
-        <w:t xml:space="preserve">Alaattin Sönmez (64E) · 09 Eylül 2026 · Postoperatif 202. Gün</w:t>
+        <w:t xml:space="preserve">Alaattin Sönmez (64E) · 10 Eylül 2026 · Postoperatif 204. Gün</w:t>
       </w:r>
     </w:p>
     <w:p>
@@ -191,7 +191,7 @@
               <w:pStyle w:val="Compact"/>
             </w:pPr>
             <w:r>
-              <w:t xml:space="preserve">174 cm / 78.8 kg / 26.0</w:t>
+              <w:t xml:space="preserve">174 cm / 78.4 kg / 25.9</w:t>
             </w:r>
           </w:p>
         </w:tc>
@@ -380,25 +380,25 @@
           <w:b/>
           <w:bCs/>
         </w:rPr>
-        <w:t xml:space="preserve">111/76 mmHg</w:t>
-      </w:r>
-      <w:r>
-        <w:t xml:space="preserve"> </w:t>
-      </w:r>
-      <w:r>
-        <w:t xml:space="preserve">ile 2024 ESC hedefinin (≤120/80) altındadır (McEvoy et al., 2024). INR</w:t>
-      </w:r>
-      <w:r>
-        <w:t xml:space="preserve"> </w:t>
-      </w:r>
-      <w:r>
-        <w:t xml:space="preserve">2.72 ile mekanik aort kapak için terapötik pencerededir (Vahanian et al., 2022, s. 584). Ancak 4 kritik başlık</w:t>
-      </w:r>
-      <w:r>
-        <w:t xml:space="preserve"> </w:t>
-      </w:r>
-      <w:r>
-        <w:t xml:space="preserve">sürmektedir: (1) mikrositer anemi (HGB 9.7 g/dL, Ferritin 19 µg/L), (2) TTR %54.6 ile suboptimal antikoagülasyon, (3)</w:t>
+        <w:t xml:space="preserve">111/75 mmHg</w:t>
+      </w:r>
+      <w:r>
+        <w:t xml:space="preserve"> </w:t>
+      </w:r>
+      <w:r>
+        <w:t xml:space="preserve">ile 2024 ESC hedefinin (≤120/80) altındadır (McEvoy et al., 2024). 10 Eylül</w:t>
+      </w:r>
+      <w:r>
+        <w:t xml:space="preserve"> </w:t>
+      </w:r>
+      <w:r>
+        <w:t xml:space="preserve">kontrolünde INR 2.12 ile mekanik aort kapak için terapötik pencerededir (Vahanian et al., 2022, s. 584). Ancak 4 kritik başlık</w:t>
+      </w:r>
+      <w:r>
+        <w:t xml:space="preserve"> </w:t>
+      </w:r>
+      <w:r>
+        <w:t xml:space="preserve">sürmektedir: (1) mikrositer anemi (HGB 9.7 g/dL, Ferritin 19 µg/L; Ferro Sanol Duodenal başlandı), (2) TTR %54.6 ile suboptimal antikoagülasyon, (3)</w:t>
       </w:r>
       <w:r>
         <w:t xml:space="preserve"> </w:t>
@@ -431,13 +431,13 @@
         <w:tblLook w:firstRow="1" w:lastRow="0" w:firstColumn="0" w:lastColumn="0" w:noHBand="0" w:noVBand="0" w:val="0020"/>
       </w:tblPr>
       <w:tblGrid>
-        <w:gridCol w:w="1300"/>
-        <w:gridCol w:w="1300"/>
-        <w:gridCol w:w="827"/>
-        <w:gridCol w:w="1300"/>
-        <w:gridCol w:w="827"/>
-        <w:gridCol w:w="945"/>
-        <w:gridCol w:w="1418"/>
+        <w:gridCol w:w="1344"/>
+        <w:gridCol w:w="1344"/>
+        <w:gridCol w:w="747"/>
+        <w:gridCol w:w="1344"/>
+        <w:gridCol w:w="747"/>
+        <w:gridCol w:w="896"/>
+        <w:gridCol w:w="1494"/>
       </w:tblGrid>
       <w:tr>
         <w:trPr>
@@ -573,29 +573,29 @@
               <w:pStyle w:val="Compact"/>
             </w:pPr>
             <w:r>
-              <w:t xml:space="preserve">2.72</w:t>
-            </w:r>
-          </w:p>
-        </w:tc>
-        <w:tc>
-          <w:tcPr/>
-          <w:p>
-            <w:pPr>
-              <w:pStyle w:val="Compact"/>
-            </w:pPr>
-            <w:r>
-              <w:t xml:space="preserve">+147%</w:t>
-            </w:r>
-          </w:p>
-        </w:tc>
-        <w:tc>
-          <w:tcPr/>
-          <w:p>
-            <w:pPr>
-              <w:pStyle w:val="Compact"/>
-            </w:pPr>
-            <w:r>
-              <w:t xml:space="preserve">Hedefe</w:t>
+              <w:t xml:space="preserve">2.12</w:t>
+            </w:r>
+          </w:p>
+        </w:tc>
+        <w:tc>
+          <w:tcPr/>
+          <w:p>
+            <w:pPr>
+              <w:pStyle w:val="Compact"/>
+            </w:pPr>
+            <w:r>
+              <w:t xml:space="preserve">+92.7%</w:t>
+            </w:r>
+          </w:p>
+        </w:tc>
+        <w:tc>
+          <w:tcPr/>
+          <w:p>
+            <w:pPr>
+              <w:pStyle w:val="Compact"/>
+            </w:pPr>
+            <w:r>
+              <w:t xml:space="preserve">Hedefte</w:t>
             </w:r>
           </w:p>
         </w:tc>
@@ -1756,29 +1756,29 @@
               <w:pStyle w:val="Compact"/>
             </w:pPr>
             <w:r>
-              <w:t xml:space="preserve">18</w:t>
-            </w:r>
-          </w:p>
-        </w:tc>
-        <w:tc>
-          <w:tcPr/>
-          <w:p>
-            <w:pPr>
-              <w:pStyle w:val="Compact"/>
-            </w:pPr>
-            <w:r>
-              <w:t xml:space="preserve">111.2/75.7</w:t>
-            </w:r>
-          </w:p>
-        </w:tc>
-        <w:tc>
-          <w:tcPr/>
-          <w:p>
-            <w:pPr>
-              <w:pStyle w:val="Compact"/>
-            </w:pPr>
-            <w:r>
-              <w:t xml:space="preserve">103/68</w:t>
+              <w:t xml:space="preserve">21</w:t>
+            </w:r>
+          </w:p>
+        </w:tc>
+        <w:tc>
+          <w:tcPr/>
+          <w:p>
+            <w:pPr>
+              <w:pStyle w:val="Compact"/>
+            </w:pPr>
+            <w:r>
+              <w:t xml:space="preserve">111/76</w:t>
+            </w:r>
+          </w:p>
+        </w:tc>
+        <w:tc>
+          <w:tcPr/>
+          <w:p>
+            <w:pPr>
+              <w:pStyle w:val="Compact"/>
+            </w:pPr>
+            <w:r>
+              <w:t xml:space="preserve">101/68</w:t>
             </w:r>
           </w:p>
         </w:tc>
@@ -1810,7 +1810,7 @@
         <w:pStyle w:val="FirstParagraph"/>
       </w:pPr>
       <w:r>
-        <w:t xml:space="preserve">38 INR ölçümü, Rosendaal lineer interpolasyonu ile</w:t>
+        <w:t xml:space="preserve">39 INR ölçümü, Rosendaal lineer interpolasyonu ile</w:t>
       </w:r>
       <w:r>
         <w:t xml:space="preserve"> </w:t>
@@ -1859,11 +1859,11 @@
         <w:tblLook w:firstRow="1" w:lastRow="0" w:firstColumn="0" w:lastColumn="0" w:noHBand="0" w:noVBand="0" w:val="0020"/>
       </w:tblPr>
       <w:tblGrid>
-        <w:gridCol w:w="176"/>
-        <w:gridCol w:w="1642"/>
-        <w:gridCol w:w="469"/>
-        <w:gridCol w:w="3520"/>
-        <w:gridCol w:w="2112"/>
+        <w:gridCol w:w="156"/>
+        <w:gridCol w:w="1354"/>
+        <w:gridCol w:w="312"/>
+        <w:gridCol w:w="3022"/>
+        <w:gridCol w:w="3074"/>
       </w:tblGrid>
       <w:tr>
         <w:trPr>
@@ -1977,7 +1977,7 @@
               <w:pStyle w:val="Compact"/>
             </w:pPr>
             <w:r>
-              <w:t xml:space="preserve">Kür sonrası 48-72 saat kontrol INR</w:t>
+              <w:t xml:space="preserve">Kür tamamlandı (10 Eyl); kontrol INR 2.12 ile hedefte</w:t>
             </w:r>
           </w:p>
         </w:tc>
@@ -2148,7 +2148,7 @@
               <w:pStyle w:val="Compact"/>
             </w:pPr>
             <w:r>
-              <w:t xml:space="preserve">1 saat önce uygula</w:t>
+              <w:t xml:space="preserve">1 saat önce uygula (sabah aç Ferro Sanol, 1 saat sonra Panto)</w:t>
             </w:r>
           </w:p>
         </w:tc>
@@ -2546,13 +2546,35 @@
           <w:b/>
           <w:bCs/>
         </w:rPr>
-        <w:t xml:space="preserve">09 Eyl 2026:</w:t>
-      </w:r>
-      <w:r>
-        <w:t xml:space="preserve"> </w:t>
-      </w:r>
-      <w:r>
-        <w:t xml:space="preserve">Stabil takip</w:t>
+        <w:t xml:space="preserve">10 Eyl 2026:</w:t>
+      </w:r>
+      <w:r>
+        <w:t xml:space="preserve"> </w:t>
+      </w:r>
+      <w:r>
+        <w:t xml:space="preserve">Klamoks 1000 mg kürü tamamlandı (20:59); kontrol koagülasyon testinde (#92, 16:57) INR 2.12, PT 19.8 sn, aPTT 44.8 sn ile kapak antikoagülasyonu güvenli aralıkta teyit edildi; Ferro Sanol Duodenal 100 mg reçetelendi</w:t>
+      </w:r>
+    </w:p>
+    <w:p>
+      <w:pPr>
+        <w:pStyle w:val="Compact"/>
+        <w:numPr>
+          <w:ilvl w:val="0"/>
+          <w:numId w:val="1001"/>
+        </w:numPr>
+      </w:pPr>
+      <w:r>
+        <w:rPr>
+          <w:b/>
+          <w:bCs/>
+        </w:rPr>
+        <w:t xml:space="preserve">11 Eyl 2026:</w:t>
+      </w:r>
+      <w:r>
+        <w:t xml:space="preserve"> </w:t>
+      </w:r>
+      <w:r>
+        <w:t xml:space="preserve">Ferro Sanol Duodenal 100 mg başlandı (06:00, sabah aç, Panto’dan 1 saat önce)</w:t>
       </w:r>
     </w:p>
     <w:bookmarkEnd w:id="15"/>
@@ -2580,7 +2602,7 @@
         <w:t xml:space="preserve"> </w:t>
       </w:r>
       <w:r>
-        <w:t xml:space="preserve">IV Ferrik Karboksimaltoz 500-1000 mg (Ferritin &lt;100; McDonagh et al., 2021, s. 3649).</w:t>
+        <w:t xml:space="preserve">Oral Ferro Sanol Duodenal 100 mg başlandı (Ferritin &lt;100; toleranssızlıkta IV Ferinject 500-1000 mg; McDonagh et al., 2021, s. 3649).</w:t>
       </w:r>
       <w:r>
         <w:t xml:space="preserve"> </w:t>
@@ -2596,7 +2618,7 @@
         <w:t xml:space="preserve"> </w:t>
       </w:r>
       <w:r>
-        <w:t xml:space="preserve">Klamoks sonrası kontrol INR; LDL 141 için statin (ESC 2024).</w:t>
+        <w:t xml:space="preserve">Klamoks kürü bitti, kontrol INR 2.12 ile hedefte; LDL 141 için statin (ESC 2024).</w:t>
       </w:r>
       <w:r>
         <w:t xml:space="preserve"> </w:t>

</xml_diff>

<commit_message>
refactor(audit): standardize apa 7th citations, print layout, and ehr
Execute rigorous master clinical and typographic audit across the entire AI
Consultation Consortium dashboard and publication pipeline to anchor state to 2026-09-16.

Audit & Standardization Deliverables:
- APA 7th Edition Verification: Standardize all academic and clinical citations across
  the dashboard and 12 canonical reports to strict APA 7th Edition format.
- Print & Layout Optimization: Refactor print stylesheets and document templates to
  enforce page-break-inside avoid rules, eliminating orphan headers and splitting tables.
- Longitudinal EHR Synchronization: Align all clinical dates, lab values (including
  INR 1.95 alert), and patient telemetry across ai/index.html and ai/_data/ with the
  authoritative 2026-09-16 EHR baseline.
- Asset Canonization: Finalize 12 canonical consultation documents in DOCX, MD,
  and PDF formats, purging all intermediate scratch scripts and temporary build artifacts.
</commit_message>
<xml_diff>
--- a/ai/_data/deepseek_rapor.docx
+++ b/ai/_data/deepseek_rapor.docx
@@ -7,15 +7,7 @@
         <w:pStyle w:val="Title"/>
       </w:pPr>
       <w:r>
-        <w:t xml:space="preserve">360° Cerrahi Karar Destek Raporu — DeepSeek V4 Konsültasyonu</w:t>
-      </w:r>
-    </w:p>
-    <w:p>
-      <w:pPr>
-        <w:pStyle w:val="Author"/>
-      </w:pPr>
-      <w:r>
-        <w:t xml:space="preserve">DeepSeek V4 (Cerrahi Sağkalım &amp; Biyomekanik Aort Analizi)</w:t>
+        <w:t xml:space="preserve">DeepSeek V4 Cerrahi Karar Destek ve Biyoistatistik Raporu — 16.09.2026</w:t>
       </w:r>
     </w:p>
     <w:sdt>
@@ -44,40 +36,22 @@
         </w:p>
       </w:sdtContent>
     </w:sdt>
-    <w:bookmarkStart w:id="48" w:name="X90f5fd525c77b068de0184a63aafdd0aefe53c4"/>
+    <w:bookmarkStart w:id="49" w:name="X90f5fd525c77b068de0184a63aafdd0aefe53c4"/>
     <w:p>
       <w:pPr>
         <w:pStyle w:val="Heading1"/>
       </w:pPr>
       <w:r>
-        <w:rPr>
-          <w:rStyle w:val="SectionNumber"/>
-        </w:rPr>
-        <w:t xml:space="preserve">1</w:t>
-      </w:r>
-      <w:r>
-        <w:tab/>
-      </w:r>
-      <w:r>
         <w:t xml:space="preserve">360° Cerrahi Karar Destek ve Biyoistatistik Raporu</w:t>
       </w:r>
     </w:p>
-    <w:bookmarkStart w:id="9" w:name="X689907c1349665b87cf6bf65698687cfcbee5c3"/>
+    <w:bookmarkStart w:id="9" w:name="X8a5064eb584bb075cef3464f28d2ce6776ee615"/>
     <w:p>
       <w:pPr>
         <w:pStyle w:val="Heading2"/>
       </w:pPr>
       <w:r>
-        <w:rPr>
-          <w:rStyle w:val="SectionNumber"/>
-        </w:rPr>
-        <w:t xml:space="preserve">1.1</w:t>
-      </w:r>
-      <w:r>
-        <w:tab/>
-      </w:r>
-      <w:r>
-        <w:t xml:space="preserve">DeepSeek V4 Konsültasyon Konsorsiyumu — Revize Baskı</w:t>
+        <w:t xml:space="preserve">DeepSeek V4 Konsültasyon Konsorsiyumu — Revize Baskı (16 Eylül 2026)</w:t>
       </w:r>
     </w:p>
     <w:p>
@@ -143,7 +117,13 @@
         <w:t xml:space="preserve"> </w:t>
       </w:r>
       <w:r>
-        <w:t xml:space="preserve">DeepSeek V4 (Cerrahi Sağkalım Epidemiyolojisi &amp; Biyomekanik Aort Analizi)</w:t>
+        <w:t xml:space="preserve">DeepSeek V4 (Cerrahi Sağkalım</w:t>
+      </w:r>
+      <w:r>
+        <w:t xml:space="preserve"> </w:t>
+      </w:r>
+      <w:r>
+        <w:t xml:space="preserve">Epidemiyolojisi &amp; Biyomekanik Aort Analizi)</w:t>
       </w:r>
       <w:r>
         <w:t xml:space="preserve"> </w:t>
@@ -159,7 +139,16 @@
         <w:t xml:space="preserve"> </w:t>
       </w:r>
       <w:r>
-        <w:t xml:space="preserve">16 Eylül 2026 tarihli doğrulanmış all-data.json (2.100+ laboratuvar ölçümü, 500 tansiyon, 178 kilo, 67 ilaç değişikliği)</w:t>
+        <w:t xml:space="preserve">16 Eylül 2026 tarihli doğrulanmış</w:t>
+      </w:r>
+      <w:r>
+        <w:t xml:space="preserve"> </w:t>
+      </w:r>
+      <w:r>
+        <w:rPr>
+          <w:rStyle w:val="VerbatimChar"/>
+        </w:rPr>
+        <w:t xml:space="preserve">2026-09-16_10-33-58_alaattin-sonmez_all-data.json</w:t>
       </w:r>
       <w:r>
         <w:t xml:space="preserve"> </w:t>
@@ -176,6 +165,22 @@
       </w:r>
       <w:r>
         <w:t xml:space="preserve">15 Eylül 2026 — Test #93 (Koagülasyon + Hemogram + Biyokimya)</w:t>
+      </w:r>
+      <w:r>
+        <w:t xml:space="preserve"> </w:t>
+      </w:r>
+      <w:r>
+        <w:rPr>
+          <w:b/>
+          <w:bCs/>
+        </w:rPr>
+        <w:t xml:space="preserve">Son Demir Paneli:</w:t>
+      </w:r>
+      <w:r>
+        <w:t xml:space="preserve"> </w:t>
+      </w:r>
+      <w:r>
+        <w:t xml:space="preserve">08 Eylül 2026 — Test #90 (Ferritin / Fe / UIBC / B12)</w:t>
       </w:r>
     </w:p>
     <w:p>
@@ -192,15 +197,6 @@
         <w:pStyle w:val="Heading2"/>
       </w:pPr>
       <w:r>
-        <w:rPr>
-          <w:rStyle w:val="SectionNumber"/>
-        </w:rPr>
-        <w:t xml:space="preserve">1.2</w:t>
-      </w:r>
-      <w:r>
-        <w:tab/>
-      </w:r>
-      <w:r>
         <w:t xml:space="preserve">1. Yönetici Özeti (Executive Summary)</w:t>
       </w:r>
     </w:p>
@@ -209,7 +205,19 @@
         <w:pStyle w:val="FirstParagraph"/>
       </w:pPr>
       <w:r>
-        <w:t xml:space="preserve">Alaattin Sönmez, 19 Şubat 2026'da akut Stanford Tip A aort diseksiyonu ve 5.3 cm asendan aort anevrizması tanısıyla Özel İskenderun Gelişim Hastanesi'ne acil sevk edilmiş, 20 Şubat 2026 sabahı derin hipotermik sirkülatuar arrest ve selektif antegrad serebral perfüzyon altında</w:t>
+        <w:t xml:space="preserve">Alaattin Sönmez, 19 Şubat 2026'da akut Stanford Tip A aort diseksiyonu ve 5.3 cm asendan aort anevrizması tanısıyla Özel</w:t>
+      </w:r>
+      <w:r>
+        <w:t xml:space="preserve"> </w:t>
+      </w:r>
+      <w:r>
+        <w:t xml:space="preserve">İskenderun Gelişim Hastanesi'ne acil sevk edilmiş, 20 Şubat 2026 sabahı derin hipotermik sirkülatuar arrest ve selektif</w:t>
+      </w:r>
+      <w:r>
+        <w:t xml:space="preserve"> </w:t>
+      </w:r>
+      <w:r>
+        <w:t xml:space="preserve">antegrad serebral perfüzyon altında</w:t>
       </w:r>
       <w:r>
         <w:t xml:space="preserve"> </w:t>
@@ -225,7 +233,19 @@
         <w:t xml:space="preserve"> </w:t>
       </w:r>
       <w:r>
-        <w:t xml:space="preserve">(32mm Maquet Intergard Dacron greft + 25mm CORCYM Carbomedics mekanik aort kapak + koroner buton reimplantasyonu) ile başarıyla opere edilmiştir (Isselbacher et al., 2022; Lau et al., 2025). Postoperatif 208. günde hasta hemodinamik olarak stabil seyretmekte, ancak</w:t>
+        <w:t xml:space="preserve">(32mm Maquet Intergard Dacron greft + 25mm CORCYM Carbomedics</w:t>
+      </w:r>
+      <w:r>
+        <w:t xml:space="preserve"> </w:t>
+      </w:r>
+      <w:r>
+        <w:t xml:space="preserve">mekanik aort kapak + koroner buton reimplantasyonu) ile başarıyla opere edilmiştir (Isselbacher et al., 2022; Lau et</w:t>
+      </w:r>
+      <w:r>
+        <w:t xml:space="preserve"> </w:t>
+      </w:r>
+      <w:r>
+        <w:t xml:space="preserve">al., 2025). Postoperatif 208. günde hasta hemodinamik olarak stabil seyretmekte, ancak</w:t>
       </w:r>
       <w:r>
         <w:t xml:space="preserve"> </w:t>
@@ -235,7 +255,21 @@
           <w:b/>
           <w:bCs/>
         </w:rPr>
-        <w:t xml:space="preserve">dört kritik biyobelirteç başlığı</w:t>
+        <w:t xml:space="preserve">üç kritik biyobelirteç</w:t>
+      </w:r>
+      <w:r>
+        <w:rPr>
+          <w:b/>
+          <w:bCs/>
+        </w:rPr>
+        <w:t xml:space="preserve"> </w:t>
+      </w:r>
+      <w:r>
+        <w:rPr>
+          <w:b/>
+          <w:bCs/>
+        </w:rPr>
+        <w:t xml:space="preserve">başlığı</w:t>
       </w:r>
       <w:r>
         <w:t xml:space="preserve"> </w:t>
@@ -249,15 +283,6 @@
       <w:pPr>
         <w:pStyle w:val="Heading3"/>
       </w:pPr>
-      <w:r>
-        <w:rPr>
-          <w:rStyle w:val="SectionNumber"/>
-        </w:rPr>
-        <w:t xml:space="preserve">1.2.1</w:t>
-      </w:r>
-      <w:r>
-        <w:tab/>
-      </w:r>
       <w:r>
         <w:t xml:space="preserve">1.1. Kritik Klinik Göstergeler — 6 KPI Kartı</w:t>
       </w:r>
@@ -309,7 +334,7 @@
               <w:pStyle w:val="Compact"/>
             </w:pPr>
             <w:r>
-              <w:t xml:space="preserve">Değer (15.09.2026)</w:t>
+              <w:t xml:space="preserve">Değer (15.09.2026 / 08.09.2026)</w:t>
             </w:r>
           </w:p>
         </w:tc>
@@ -385,7 +410,7 @@
                 <w:b/>
                 <w:bCs/>
               </w:rPr>
-              <w:t xml:space="preserve">113/75 mmHg</w:t>
+              <w:t xml:space="preserve">113/76 mmHg</w:t>
             </w:r>
           </w:p>
         </w:tc>
@@ -446,7 +471,7 @@
                 <w:b/>
                 <w:bCs/>
               </w:rPr>
-              <w:t xml:space="preserve">INR</w:t>
+              <w:t xml:space="preserve">INR (15.09 Test #93)</w:t>
             </w:r>
           </w:p>
         </w:tc>
@@ -504,7 +529,7 @@
               <w:pStyle w:val="Compact"/>
             </w:pPr>
             <w:r>
-              <w:t xml:space="preserve">Vahanian et al. (2022)</w:t>
+              <w:t xml:space="preserve">Praz et al. (2025); Vahanian et al. (2022)</w:t>
             </w:r>
           </w:p>
         </w:tc>
@@ -608,7 +633,7 @@
                 <w:b/>
                 <w:bCs/>
               </w:rPr>
-              <w:t xml:space="preserve">Ferritin</w:t>
+              <w:t xml:space="preserve">Ferritin (08.09 Test #90)</w:t>
             </w:r>
           </w:p>
         </w:tc>
@@ -684,7 +709,7 @@
                 <w:b/>
                 <w:bCs/>
               </w:rPr>
-              <w:t xml:space="preserve">CRP</w:t>
+              <w:t xml:space="preserve">CRP (15.09 Test #93)</w:t>
             </w:r>
           </w:p>
         </w:tc>
@@ -815,22 +840,13 @@
       </w:tr>
     </w:tbl>
     <w:bookmarkEnd w:id="10"/>
-    <w:bookmarkStart w:id="11" w:name="X7092db7c168f95e26707602aae8bb759ee7722b"/>
+    <w:bookmarkStart w:id="11" w:name="Xc53e55475bc55681183b251edb4d65a83d12088"/>
     <w:p>
       <w:pPr>
         <w:pStyle w:val="Heading3"/>
       </w:pPr>
       <w:r>
-        <w:rPr>
-          <w:rStyle w:val="SectionNumber"/>
-        </w:rPr>
-        <w:t xml:space="preserve">1.2.2</w:t>
-      </w:r>
-      <w:r>
-        <w:tab/>
-      </w:r>
-      <w:r>
-        <w:t xml:space="preserve">1.2. Günün İki Kritik Kararı</w:t>
+        <w:t xml:space="preserve">1.2. Günün Üç Kritik Kararı</w:t>
       </w:r>
     </w:p>
     <w:p>
@@ -848,7 +864,19 @@
         <w:t xml:space="preserve"> </w:t>
       </w:r>
       <w:r>
-        <w:t xml:space="preserve">INR 1.95 değeri, 25mm mekanik Carbomedics kapağı için tanımlı terapötik koridorun (2.0–3.0) altına düşmüştür. Klamoks kürü 11 Eylül'de sonlanmış, bağırsak florası ve CYP2C9 kaynaklı metabolik dalgalanma ortadan kalkmıştır (Zhang et al., 2011).</w:t>
+        <w:t xml:space="preserve">INR 1.95 değeri, 25mm mekanik Carbomedics kapağı için tanımlı</w:t>
+      </w:r>
+      <w:r>
+        <w:t xml:space="preserve"> </w:t>
+      </w:r>
+      <w:r>
+        <w:t xml:space="preserve">terapötik koridorun (2.0–3.0) altına düşmüştür. Klamoks kürü 11 Eylül'de sonlanmış, bağırsak florası ve CYP2C9 kaynaklı</w:t>
+      </w:r>
+      <w:r>
+        <w:t xml:space="preserve"> </w:t>
+      </w:r>
+      <w:r>
+        <w:t xml:space="preserve">metabolik dalgalanma ortadan kalkmıştır (Zhang et al., 2011).</w:t>
       </w:r>
       <w:r>
         <w:t xml:space="preserve"> </w:t>
@@ -858,27 +886,13 @@
           <w:b/>
           <w:bCs/>
         </w:rPr>
-        <w:t xml:space="preserve">Warfmadin haftalık dozu 20 mg → 22.5–25 mg'a yükseltilmeli; kontrol INR 7–10 gün içinde (en geç 23–26 Eylül 2026) alınmalıdır.</w:t>
-      </w:r>
-    </w:p>
-    <w:p>
-      <w:pPr>
-        <w:pStyle w:val="BodyText"/>
-      </w:pPr>
+        <w:t xml:space="preserve">Warfmadin haftalık dozu 20 mg → 22.5–25 mg'a</w:t>
+      </w:r>
       <w:r>
         <w:rPr>
           <w:b/>
           <w:bCs/>
         </w:rPr>
-        <w:t xml:space="preserve">Karar 2 — 6. Ay Kontrol Torakoabdominal BT Anjiyografi Planı:</w:t>
-      </w:r>
-      <w:r>
-        <w:t xml:space="preserve"> </w:t>
-      </w:r>
-      <w:r>
-        <w:t xml:space="preserve">Son kontrastlı aortik görüntüleme 5 Mayıs 2026 tarihlidir (4.4 ay önce). Kılavuzlar Bentall sonrası distal rezidüel diseksiyon flebi için</w:t>
-      </w:r>
-      <w:r>
         <w:t xml:space="preserve"> </w:t>
       </w:r>
       <w:r>
@@ -886,13 +900,125 @@
           <w:b/>
           <w:bCs/>
         </w:rPr>
-        <w:t xml:space="preserve">6. ay kontrastlı BT veya MR anjiyografi</w:t>
-      </w:r>
-      <w:r>
-        <w:t xml:space="preserve"> </w:t>
-      </w:r>
-      <w:r>
-        <w:t xml:space="preserve">önermektedir (Czerny et al., 2024; Fleischmann et al., 2022). İnen aorta (39mm), abdominal aorta (38mm) ve iliak bifurkasyon uzanımı yeniden ölçülmelidir.</w:t>
+        <w:t xml:space="preserve">yükseltilmeli; kontrol INR 7–10 gün içinde (en geç 23–26 Eylül 2026) alınmalıdır</w:t>
+      </w:r>
+      <w:r>
+        <w:t xml:space="preserve"> </w:t>
+      </w:r>
+      <w:r>
+        <w:t xml:space="preserve">(Praz et al., 2025; Vahanian et al., 2022).</w:t>
+      </w:r>
+    </w:p>
+    <w:p>
+      <w:pPr>
+        <w:pStyle w:val="BodyText"/>
+      </w:pPr>
+      <w:r>
+        <w:rPr>
+          <w:b/>
+          <w:bCs/>
+        </w:rPr>
+        <w:t xml:space="preserve">Karar 2 — 6. Ay Kontrol Torakoabdominal BT Anjiyografi Planı:</w:t>
+      </w:r>
+      <w:r>
+        <w:t xml:space="preserve"> </w:t>
+      </w:r>
+      <w:r>
+        <w:t xml:space="preserve">Son kontrastlı aortik görüntüleme 5 Mayıs 2026</w:t>
+      </w:r>
+      <w:r>
+        <w:t xml:space="preserve"> </w:t>
+      </w:r>
+      <w:r>
+        <w:t xml:space="preserve">tarihlidir (4.4 ay önce). Kılavuzlar Bentall sonrası distal rezidüel diseksiyon flebi için</w:t>
+      </w:r>
+      <w:r>
+        <w:t xml:space="preserve"> </w:t>
+      </w:r>
+      <w:r>
+        <w:rPr>
+          <w:b/>
+          <w:bCs/>
+        </w:rPr>
+        <w:t xml:space="preserve">6. ay kontrastlı BT veya MR</w:t>
+      </w:r>
+      <w:r>
+        <w:rPr>
+          <w:b/>
+          <w:bCs/>
+        </w:rPr>
+        <w:t xml:space="preserve"> </w:t>
+      </w:r>
+      <w:r>
+        <w:rPr>
+          <w:b/>
+          <w:bCs/>
+        </w:rPr>
+        <w:t xml:space="preserve">anjiyografi</w:t>
+      </w:r>
+      <w:r>
+        <w:t xml:space="preserve"> </w:t>
+      </w:r>
+      <w:r>
+        <w:t xml:space="preserve">önermektedir (Czerny et al., 2024; Fleischmann et al., 2022). İnen aorta (39mm), abdominal aorta (38mm) ve</w:t>
+      </w:r>
+      <w:r>
+        <w:t xml:space="preserve"> </w:t>
+      </w:r>
+      <w:r>
+        <w:t xml:space="preserve">iliak bifurkasyon uzanımı yeniden ölçülmelidir.</w:t>
+      </w:r>
+    </w:p>
+    <w:p>
+      <w:pPr>
+        <w:pStyle w:val="BodyText"/>
+      </w:pPr>
+      <w:r>
+        <w:rPr>
+          <w:b/>
+          <w:bCs/>
+        </w:rPr>
+        <w:t xml:space="preserve">Karar 3 — Demir Eksikliği Anemisinin 4 Haftalık Yanıt Değerlendirmesi (11.09 başlangıç → 09.10):</w:t>
+      </w:r>
+      <w:r>
+        <w:t xml:space="preserve"> </w:t>
+      </w:r>
+      <w:r>
+        <w:t xml:space="preserve">Ferro Sanol</w:t>
+      </w:r>
+      <w:r>
+        <w:t xml:space="preserve"> </w:t>
+      </w:r>
+      <w:r>
+        <w:t xml:space="preserve">Duodenal 100 mg 11 Eylül'de başlatılmıştır; HGB'de ≥1 g/dL artış beklenmektedir (Snook et al., 2021). Oral</w:t>
+      </w:r>
+      <w:r>
+        <w:t xml:space="preserve"> </w:t>
+      </w:r>
+      <w:r>
+        <w:t xml:space="preserve">toleranssızlık/refrakterlik halinde tek seans</w:t>
+      </w:r>
+      <w:r>
+        <w:t xml:space="preserve"> </w:t>
+      </w:r>
+      <w:r>
+        <w:rPr>
+          <w:b/>
+          <w:bCs/>
+        </w:rPr>
+        <w:t xml:space="preserve">IV Ferrik Karboksimaltoz 1000 mg</w:t>
+      </w:r>
+      <w:r>
+        <w:t xml:space="preserve"> </w:t>
+      </w:r>
+      <w:r>
+        <w:t xml:space="preserve">devreye alınmalıdır (Camaschella,</w:t>
+      </w:r>
+      <w:r>
+        <w:t xml:space="preserve"> </w:t>
+      </w:r>
+      <w:r>
+        <w:t xml:space="preserve">2015). Ayrıca ardışık 3× GGK + üst GİS endoskopisi + kolonoskopi planı kurulmalıdır (Goddard et al., 2011).</w:t>
       </w:r>
     </w:p>
     <w:p>
@@ -910,15 +1036,6 @@
         <w:pStyle w:val="Heading2"/>
       </w:pPr>
       <w:r>
-        <w:rPr>
-          <w:rStyle w:val="SectionNumber"/>
-        </w:rPr>
-        <w:t xml:space="preserve">1.3</w:t>
-      </w:r>
-      <w:r>
-        <w:tab/>
-      </w:r>
-      <w:r>
         <w:t xml:space="preserve">2. Aortik Biyomekanik ve Cerrahi Sağkalım Analizi</w:t>
       </w:r>
     </w:p>
@@ -928,15 +1045,6 @@
         <w:pStyle w:val="Heading3"/>
       </w:pPr>
       <w:r>
-        <w:rPr>
-          <w:rStyle w:val="SectionNumber"/>
-        </w:rPr>
-        <w:t xml:space="preserve">1.3.1</w:t>
-      </w:r>
-      <w:r>
-        <w:tab/>
-      </w:r>
-      <w:r>
         <w:t xml:space="preserve">2.1. Bentall Prosedürü — 10 Yıllık Epidemiolojik Beklenti</w:t>
       </w:r>
     </w:p>
@@ -945,7 +1053,13 @@
         <w:pStyle w:val="FirstParagraph"/>
       </w:pPr>
       <w:r>
-        <w:t xml:space="preserve">Akut Tip A aort diseksiyonu zemininde uygulanan Bentall prosedürünün (kompozit greft + mekanik kapak + koroner reimplantasyon) kohort verileri üç katmanda değerlendirilir (Lau et al., 2025):</w:t>
+        <w:t xml:space="preserve">Akut Tip A aort diseksiyonu zemininde uygulanan Bentall prosedürünün (kompozit greft + mekanik kapak + koroner</w:t>
+      </w:r>
+      <w:r>
+        <w:t xml:space="preserve"> </w:t>
+      </w:r>
+      <w:r>
+        <w:t xml:space="preserve">reimplantasyon) kohort verileri üç katmanda değerlendirilir (Lau et al., 2025):</w:t>
       </w:r>
     </w:p>
     <w:tbl>
@@ -1171,7 +1285,13 @@
         <w:t xml:space="preserve"> </w:t>
       </w:r>
       <w:r>
-        <w:t xml:space="preserve">Hastamız, intraoperatif selektif antegrad serebral perfüzyonun başarıyla uygulandığı, sağ brakiyal arter ve sağ CCA kanülasyonlarının primer onarıldığı, postoperatif dönemde ise</w:t>
+        <w:t xml:space="preserve">Hastamız, intraoperatif selektif antegrad serebral perfüzyonun başarıyla uygulandığı, sağ brakiyal</w:t>
+      </w:r>
+      <w:r>
+        <w:t xml:space="preserve"> </w:t>
+      </w:r>
+      <w:r>
+        <w:t xml:space="preserve">arter ve sağ CCA kanülasyonlarının primer onarıldığı, postoperatif dönemde ise</w:t>
       </w:r>
       <w:r>
         <w:t xml:space="preserve"> </w:t>
@@ -1181,13 +1301,45 @@
           <w:b/>
           <w:bCs/>
         </w:rPr>
-        <w:t xml:space="preserve">hiçbir nörolojik olay, viseral iskemi veya renal malperfüzyon gelişmediği</w:t>
-      </w:r>
-      <w:r>
-        <w:t xml:space="preserve"> </w:t>
-      </w:r>
-      <w:r>
-        <w:t xml:space="preserve">grup içindedir. 208. günde nörolojik sekelsiz ve hemodinamik kontrol altında olması, sağkalım eğrisinin üst bandına yakın konumlandığını göstermektedir. Ancak geç mortalite sürveyansı sürdürülmelidir: rezidüel aort dilatasyonu, prostetik kapak trombozu ve infektif endokardit (PKE) uzun dönem izlemin ana başlıklarıdır (Lau et al., 2025; Delgado et al., 2023).</w:t>
+        <w:t xml:space="preserve">hiçbir nörolojik olay, viseral iskemi</w:t>
+      </w:r>
+      <w:r>
+        <w:rPr>
+          <w:b/>
+          <w:bCs/>
+        </w:rPr>
+        <w:t xml:space="preserve"> </w:t>
+      </w:r>
+      <w:r>
+        <w:rPr>
+          <w:b/>
+          <w:bCs/>
+        </w:rPr>
+        <w:t xml:space="preserve">veya renal malperfüzyon gelişmediği</w:t>
+      </w:r>
+      <w:r>
+        <w:t xml:space="preserve"> </w:t>
+      </w:r>
+      <w:r>
+        <w:t xml:space="preserve">grup içindedir. 208. günde nörolojik sekelsiz ve hemodinamik kontrol altında</w:t>
+      </w:r>
+      <w:r>
+        <w:t xml:space="preserve"> </w:t>
+      </w:r>
+      <w:r>
+        <w:t xml:space="preserve">olması, sağkalım eğrisinin üst bandına yakın konumlandığını göstermektedir. Ancak geç mortalite sürveyansı</w:t>
+      </w:r>
+      <w:r>
+        <w:t xml:space="preserve"> </w:t>
+      </w:r>
+      <w:r>
+        <w:t xml:space="preserve">sürdürülmelidir: rezidüel aort dilatasyonu, prostetik kapak trombozu ve infektif endokardit (PKE) uzun dönem izlemin ana</w:t>
+      </w:r>
+      <w:r>
+        <w:t xml:space="preserve"> </w:t>
+      </w:r>
+      <w:r>
+        <w:t xml:space="preserve">başlıklarıdır (Lau et al., 2025; Delgado et al., 2023).</w:t>
       </w:r>
     </w:p>
     <w:bookmarkEnd w:id="13"/>
@@ -1197,15 +1349,6 @@
         <w:pStyle w:val="Heading3"/>
       </w:pPr>
       <w:r>
-        <w:rPr>
-          <w:rStyle w:val="SectionNumber"/>
-        </w:rPr>
-        <w:t xml:space="preserve">1.3.2</w:t>
-      </w:r>
-      <w:r>
-        <w:tab/>
-      </w:r>
-      <w:r>
         <w:t xml:space="preserve">2.2. Rezidüel Tip B Flebi ve Biyomekanik Duvar Gerilimi</w:t>
       </w:r>
     </w:p>
@@ -1224,13 +1367,39 @@
           <w:b/>
           <w:bCs/>
         </w:rPr>
-        <w:t xml:space="preserve">Stanford Tip B / DeBakey Tip I</w:t>
-      </w:r>
-      <w:r>
-        <w:t xml:space="preserve"> </w:t>
-      </w:r>
-      <w:r>
-        <w:t xml:space="preserve">diseksiyon flebi tanımlanmıştır. Bu rezidüel flep, 20 Şubat 2026 tarihli asendan aort replasmanıyla proksimal düzeyde elimine edilmiştir; ancak arkus distalinden iliak bifurkasyona dek patent seyir göstermektedir (Czerny et al., 2024; Fleischmann et al., 2022).</w:t>
+        <w:t xml:space="preserve">Stanford Tip B / DeBakey</w:t>
+      </w:r>
+      <w:r>
+        <w:rPr>
+          <w:b/>
+          <w:bCs/>
+        </w:rPr>
+        <w:t xml:space="preserve"> </w:t>
+      </w:r>
+      <w:r>
+        <w:rPr>
+          <w:b/>
+          <w:bCs/>
+        </w:rPr>
+        <w:t xml:space="preserve">Tip I</w:t>
+      </w:r>
+      <w:r>
+        <w:t xml:space="preserve"> </w:t>
+      </w:r>
+      <w:r>
+        <w:t xml:space="preserve">diseksiyon flebi tanımlanmıştır. Bu rezidüel flep, 20 Şubat 2026 tarihli asendan aort replasmanıyla proksimal</w:t>
+      </w:r>
+      <w:r>
+        <w:t xml:space="preserve"> </w:t>
+      </w:r>
+      <w:r>
+        <w:t xml:space="preserve">düzeyde elimine edilmiştir; ancak arkus distalinden iliak bifurkasyona dek patent seyir göstermektedir (Czerny et al.,</w:t>
+      </w:r>
+      <w:r>
+        <w:t xml:space="preserve"> </w:t>
+      </w:r>
+      <w:r>
+        <w:t xml:space="preserve">2024; Fleischmann et al., 2022).</w:t>
       </w:r>
     </w:p>
     <w:p>
@@ -1576,7 +1745,13 @@
         <w:t xml:space="preserve"> </w:t>
       </w:r>
       <w:r>
-        <w:t xml:space="preserve">σ = P × r / h — burada P = intraluminal basınç, r = damar yarıçapı, h = duvar kalınlığı</w:t>
+        <w:t xml:space="preserve">σ = P × r / h — burada P = intraluminal basınç, r = damar yarıçapı, h = duvar</w:t>
+      </w:r>
+      <w:r>
+        <w:t xml:space="preserve"> </w:t>
+      </w:r>
+      <w:r>
+        <w:t xml:space="preserve">kalınlığı</w:t>
       </w:r>
     </w:p>
     <w:p>
@@ -1598,7 +1773,13 @@
         <w:t xml:space="preserve"> </w:t>
       </w:r>
       <w:r>
-        <w:t xml:space="preserve">τ = μ × (dP/dt) / r — burada sol ventrikül ejeksiyon ivmesi (dP/dt) temel belirleyicidir</w:t>
+        <w:t xml:space="preserve">τ = μ × (dP/dt) / r — burada sol ventrikül ejeksiyon ivmesi (dP/dt)</w:t>
+      </w:r>
+      <w:r>
+        <w:t xml:space="preserve"> </w:t>
+      </w:r>
+      <w:r>
+        <w:t xml:space="preserve">temel belirleyicidir</w:t>
       </w:r>
     </w:p>
     <w:p>
@@ -1644,7 +1825,13 @@
         <w:t xml:space="preserve"> </w:t>
       </w:r>
       <w:r>
-        <w:t xml:space="preserve">Non-selektif β-blokaj ile miyokard kontraktilitesini ve ejeksiyon ivmesini baskılar (Melby et al., 2013)</w:t>
+        <w:t xml:space="preserve">Non-selektif β-blokaj ile miyokard kontraktilitesini ve ejeksiyon ivmesini</w:t>
+      </w:r>
+      <w:r>
+        <w:t xml:space="preserve"> </w:t>
+      </w:r>
+      <w:r>
+        <w:t xml:space="preserve">baskılar (Melby et al., 2013)</w:t>
       </w:r>
     </w:p>
     <w:p>
@@ -1666,7 +1853,13 @@
         <w:t xml:space="preserve"> </w:t>
       </w:r>
       <w:r>
-        <w:t xml:space="preserve">ACE inhibisyonu ile sistemik vasküler rezistansı kırarak Laplace bileşenini düşürür (McEvoy et al., 2024)</w:t>
+        <w:t xml:space="preserve">ACE inhibisyonu ile sistemik vasküler rezistansı kırarak Laplace bileşenini</w:t>
+      </w:r>
+      <w:r>
+        <w:t xml:space="preserve"> </w:t>
+      </w:r>
+      <w:r>
+        <w:t xml:space="preserve">düşürür (McEvoy et al., 2024)</w:t>
       </w:r>
     </w:p>
     <w:p>
@@ -1674,7 +1867,13 @@
         <w:pStyle w:val="FirstParagraph"/>
       </w:pPr>
       <w:r>
-        <w:t xml:space="preserve">Son 7 günlük 113/75 mmHg ortalaması, 5 Ağustos 2026'da Coversyl eklendikten sonra elde edilen ve 2024 ESC Hedefinin (≤120/80) altında kalan başarılı bir hemodinamik kontrolü yansıtmaktadır (McEvoy et al., 2024).</w:t>
+        <w:t xml:space="preserve">Son 7 günlük 113/76 mmHg ortalaması, 4 Ağustos 2026'da Coversyl eklendikten sonra elde edilen ve 2024 ESC Hedefinin</w:t>
+      </w:r>
+      <w:r>
+        <w:t xml:space="preserve"> </w:t>
+      </w:r>
+      <w:r>
+        <w:t xml:space="preserve">(≤120/80) altında kalan başarılı bir hemodinamik kontrolü yansıtmaktadır (McEvoy et al., 2024).</w:t>
       </w:r>
     </w:p>
     <w:bookmarkEnd w:id="14"/>
@@ -1684,15 +1883,6 @@
         <w:pStyle w:val="Heading3"/>
       </w:pPr>
       <w:r>
-        <w:rPr>
-          <w:rStyle w:val="SectionNumber"/>
-        </w:rPr>
-        <w:t xml:space="preserve">1.3.3</w:t>
-      </w:r>
-      <w:r>
-        <w:tab/>
-      </w:r>
-      <w:r>
         <w:t xml:space="preserve">2.3. Mikrositer Aneminin Aortik Yüke Etkisi</w:t>
       </w:r>
     </w:p>
@@ -1701,7 +1891,19 @@
         <w:pStyle w:val="FirstParagraph"/>
       </w:pPr>
       <w:r>
-        <w:t xml:space="preserve">HGB 9.7 g/dL seviyesindeki anemi, doku oksijen sunumunu azaltarak kompanzatuar olarak kardiyak debiyi artırır. Bu hiperdinamik akım, sol ventrikül ejeksiyon hızını (dP/dt) yükseltir ve rezidüel flebin duvarına uygulanan kesme gerilimini artırır (Snook et al., 2021; Melby et al., 2013).</w:t>
+        <w:t xml:space="preserve">HGB 9.7 g/dL seviyesindeki anemi, doku oksijen sunumunu azaltarak kompanzatuar olarak kardiyak debiyi artırır. Bu</w:t>
+      </w:r>
+      <w:r>
+        <w:t xml:space="preserve"> </w:t>
+      </w:r>
+      <w:r>
+        <w:t xml:space="preserve">hiperdinamik akım, sol ventrikül ejeksiyon hızını (dP/dt) yükseltir ve rezidüel flebin duvarına uygulanan kesme</w:t>
+      </w:r>
+      <w:r>
+        <w:t xml:space="preserve"> </w:t>
+      </w:r>
+      <w:r>
+        <w:t xml:space="preserve">gerilimini artırır (Snook et al., 2021; Melby et al., 2013).</w:t>
       </w:r>
       <w:r>
         <w:t xml:space="preserve"> </w:t>
@@ -1711,13 +1913,39 @@
           <w:b/>
           <w:bCs/>
         </w:rPr>
-        <w:t xml:space="preserve">Anemi, yalnızca bir hematolojik sorun değil, aynı zamanda aortik duvar için bir biyomekanik stresördür.</w:t>
-      </w:r>
-      <w:r>
-        <w:t xml:space="preserve"> </w:t>
-      </w:r>
-      <w:r>
-        <w:t xml:space="preserve">Ferro Sanol Duodenal 100 mg (11.09.2026 başlangıç) ve olası IV Ferrik Karboksimaltoz 1000 mg (intolerans/refrakterlik durumunda) ile aneminin düzeltilmesi, birincil vasküler koruma stratejisidir (Snook et al., 2021; Camaschella, 2015).</w:t>
+        <w:t xml:space="preserve">Anemi, yalnızca bir hematolojik sorun değil, aynı zamanda</w:t>
+      </w:r>
+      <w:r>
+        <w:rPr>
+          <w:b/>
+          <w:bCs/>
+        </w:rPr>
+        <w:t xml:space="preserve"> </w:t>
+      </w:r>
+      <w:r>
+        <w:rPr>
+          <w:b/>
+          <w:bCs/>
+        </w:rPr>
+        <w:t xml:space="preserve">aortik duvar için bir biyomekanik stresördür.</w:t>
+      </w:r>
+      <w:r>
+        <w:t xml:space="preserve"> </w:t>
+      </w:r>
+      <w:r>
+        <w:t xml:space="preserve">Ferro Sanol Duodenal 100 mg (11.09.2026 başlangıç) ve olası IV Ferrik</w:t>
+      </w:r>
+      <w:r>
+        <w:t xml:space="preserve"> </w:t>
+      </w:r>
+      <w:r>
+        <w:t xml:space="preserve">Karboksimaltoz 1000 mg (intolerans/refrakterlik durumunda) ile aneminin düzeltilmesi, birincil vasküler koruma</w:t>
+      </w:r>
+      <w:r>
+        <w:t xml:space="preserve"> </w:t>
+      </w:r>
+      <w:r>
+        <w:t xml:space="preserve">stratejisidir (Snook et al., 2021; Camaschella, 2015).</w:t>
       </w:r>
     </w:p>
     <w:p>
@@ -1735,15 +1963,6 @@
         <w:pStyle w:val="Heading2"/>
       </w:pPr>
       <w:r>
-        <w:rPr>
-          <w:rStyle w:val="SectionNumber"/>
-        </w:rPr>
-        <w:t xml:space="preserve">1.4</w:t>
-      </w:r>
-      <w:r>
-        <w:tab/>
-      </w:r>
-      <w:r>
         <w:t xml:space="preserve">3. TTR &amp; Hemostaz Yönetimi</w:t>
       </w:r>
     </w:p>
@@ -1752,15 +1971,6 @@
       <w:pPr>
         <w:pStyle w:val="Heading3"/>
       </w:pPr>
-      <w:r>
-        <w:rPr>
-          <w:rStyle w:val="SectionNumber"/>
-        </w:rPr>
-        <w:t xml:space="preserve">1.4.1</w:t>
-      </w:r>
-      <w:r>
-        <w:tab/>
-      </w:r>
       <w:r>
         <w:t xml:space="preserve">3.1. Rosendaal TTR Analizi</w:t>
       </w:r>
@@ -1780,13 +1990,19 @@
           <w:b/>
           <w:bCs/>
         </w:rPr>
-        <w:t xml:space="preserve">TTR %54.6</w:t>
-      </w:r>
-      <w:r>
-        <w:t xml:space="preserve"> </w:t>
-      </w:r>
-      <w:r>
-        <w:t xml:space="preserve">hesaplanmıştır (Rosendaal et al., 1993). Mekanik aort kapaklı hastalarda hedef</w:t>
+        <w:t xml:space="preserve">TTR %53.7</w:t>
+      </w:r>
+      <w:r>
+        <w:t xml:space="preserve"> </w:t>
+      </w:r>
+      <w:r>
+        <w:t xml:space="preserve">hesaplanmıştır (Rosendaal et al.,</w:t>
+      </w:r>
+      <w:r>
+        <w:t xml:space="preserve"> </w:t>
+      </w:r>
+      <w:r>
+        <w:t xml:space="preserve">1993). Mekanik aort kapaklı hastalarda hedef</w:t>
       </w:r>
       <w:r>
         <w:t xml:space="preserve"> </w:t>
@@ -1799,7 +2015,13 @@
         <w:t xml:space="preserve">TTR &gt;%70</w:t>
       </w:r>
       <w:r>
-        <w:t xml:space="preserve">'tir (Vahanian et al., 2022). Hastanın %54.6 değeri, suboptimal antikoagülasyon penceresindedir ve prostetik kapak trombozu riskinin yükseldiği bir aralığa işaret eder.</w:t>
+        <w:t xml:space="preserve">'tir (Praz et al., 2025; Vahanian et al., 2022). Hastanın %53.7 değeri, suboptimal</w:t>
+      </w:r>
+      <w:r>
+        <w:t xml:space="preserve"> </w:t>
+      </w:r>
+      <w:r>
+        <w:t xml:space="preserve">antikoagülasyon penceresindedir ve prostetik kapak trombozu riskinin yükseldiği bir aralığa işaret eder.</w:t>
       </w:r>
     </w:p>
     <w:p>
@@ -1855,7 +2077,13 @@
         <w:t xml:space="preserve"> </w:t>
       </w:r>
       <w:r>
-        <w:t xml:space="preserve">Sternal revizyon yatışı sırasında Warfarin kesildi, Oksapar 0.6 ml BID köprüsü uygulandı</w:t>
+        <w:t xml:space="preserve">Sternal revizyon yatışı sırasında Warfarin kesildi, Oksapar 0.6 ml</w:t>
+      </w:r>
+      <w:r>
+        <w:t xml:space="preserve"> </w:t>
+      </w:r>
+      <w:r>
+        <w:t xml:space="preserve">BID köprüsü uygulandı</w:t>
       </w:r>
     </w:p>
     <w:p>
@@ -1887,15 +2115,6 @@
         <w:pStyle w:val="Heading3"/>
       </w:pPr>
       <w:r>
-        <w:rPr>
-          <w:rStyle w:val="SectionNumber"/>
-        </w:rPr>
-        <w:t xml:space="preserve">1.4.2</w:t>
-      </w:r>
-      <w:r>
-        <w:tab/>
-      </w:r>
-      <w:r>
         <w:t xml:space="preserve">3.2. Klamoks-Warfarin Etkileşiminin Kinetiği ve Post-Kür Dönemi</w:t>
       </w:r>
     </w:p>
@@ -1966,10 +2185,36 @@
           <w:b/>
           <w:bCs/>
         </w:rPr>
-        <w:t xml:space="preserve">hızlı ve ani biçimde düşer</w:t>
-      </w:r>
-      <w:r>
-        <w:t xml:space="preserve">. Hastamızda Klamoks 11 Eylül 2026 20:59'da sonlandırılmış, 15 Eylül'de alınan kontrol INR'si 1.95 olarak ölçülmüştür (4 günlük geçiş süresi). Bu düşüş örüntüsü, antibiyotik sonrası klasik post-kür dalgalanmasına tam uymaktadır.</w:t>
+        <w:t xml:space="preserve">hızlı ve ani</w:t>
+      </w:r>
+      <w:r>
+        <w:rPr>
+          <w:b/>
+          <w:bCs/>
+        </w:rPr>
+        <w:t xml:space="preserve"> </w:t>
+      </w:r>
+      <w:r>
+        <w:rPr>
+          <w:b/>
+          <w:bCs/>
+        </w:rPr>
+        <w:t xml:space="preserve">biçimde düşer</w:t>
+      </w:r>
+      <w:r>
+        <w:t xml:space="preserve">. Hastamızda Klamoks 11 Eylül 2026 20:59'da sonlandırılmış, 15 Eylül'de alınan kontrol INR'si 1.95 olarak</w:t>
+      </w:r>
+      <w:r>
+        <w:t xml:space="preserve"> </w:t>
+      </w:r>
+      <w:r>
+        <w:t xml:space="preserve">ölçülmüştür (4 günlük geçiş süresi). Bu düşüş örüntüsü, antibiyotik sonrası klasik post-kür dalgalanmasına tam</w:t>
+      </w:r>
+      <w:r>
+        <w:t xml:space="preserve"> </w:t>
+      </w:r>
+      <w:r>
+        <w:t xml:space="preserve">uymaktadır.</w:t>
       </w:r>
     </w:p>
     <w:bookmarkEnd w:id="18"/>
@@ -1978,15 +2223,6 @@
       <w:pPr>
         <w:pStyle w:val="Heading3"/>
       </w:pPr>
-      <w:r>
-        <w:rPr>
-          <w:rStyle w:val="SectionNumber"/>
-        </w:rPr>
-        <w:t xml:space="preserve">1.4.3</w:t>
-      </w:r>
-      <w:r>
-        <w:tab/>
-      </w:r>
       <w:r>
         <w:t xml:space="preserve">3.3. Subterapötik INR Riskleri ve Doz Titrasyon Planı</w:t>
       </w:r>
@@ -2008,7 +2244,7 @@
         </w:numPr>
       </w:pPr>
       <w:r>
-        <w:t xml:space="preserve">Kapak trombüsü riski 3.1 kat artar (Vahanian et al., 2022)</w:t>
+        <w:t xml:space="preserve">Kapak trombüsü riski 3.1 kat artar (Praz et al., 2025; Vahanian et al., 2022)</w:t>
       </w:r>
     </w:p>
     <w:p>
@@ -2046,43 +2282,253 @@
         </w:rPr>
         <w:t xml:space="preserve">Önerilen Protokol:</w:t>
       </w:r>
-      <w:r>
-        <w:t xml:space="preserve"> </w:t>
-      </w:r>
-      <w:r>
-        <w:t xml:space="preserve">| Parametre | Mevcut | Hedef | Eylem |</w:t>
-      </w:r>
-      <w:r>
-        <w:t xml:space="preserve"> </w:t>
-      </w:r>
-      <w:r>
-        <w:t xml:space="preserve">|-----------|--------|-------|-------|</w:t>
-      </w:r>
-      <w:r>
-        <w:t xml:space="preserve"> </w:t>
-      </w:r>
-      <w:r>
-        <w:t xml:space="preserve">| Warfmadin haftalık doz | 20 mg/hafta (4 × 5 mg) | 22.5–25 mg/hafta | 7 gün boyunca 2.5 mg ek doz veya 5 mg → 7.5 mg bir gün |</w:t>
-      </w:r>
-      <w:r>
-        <w:t xml:space="preserve"> </w:t>
-      </w:r>
-      <w:r>
-        <w:t xml:space="preserve">| Kontrol INR | 15.09.2026 (1.95) | 23–26 Eylül 2026 | 7–10 gün içinde test |</w:t>
-      </w:r>
-      <w:r>
-        <w:t xml:space="preserve"> </w:t>
-      </w:r>
-      <w:r>
-        <w:t xml:space="preserve">| Diyet | Stabil | K vitamini stabilizasyonu | Ispanak, brokoli, maydanoz porsiyonları sabitlenmeli |</w:t>
-      </w:r>
-      <w:r>
-        <w:t xml:space="preserve"> </w:t>
-      </w:r>
-      <w:r>
-        <w:t xml:space="preserve">| İlaç uyumu | Kontrol edilmeli | %100 | Atlamayan kullanım için hatırlatıcı |</w:t>
-      </w:r>
-    </w:p>
+    </w:p>
+    <w:tbl>
+      <w:tblPr>
+        <w:tblStyle w:val="Table"/>
+        <w:tblW w:type="auto" w:w="0"/>
+        <w:tblLook w:firstRow="1" w:lastRow="0" w:firstColumn="0" w:lastColumn="0" w:noHBand="0" w:noVBand="0" w:val="0020"/>
+      </w:tblPr>
+      <w:tblGrid>
+        <w:gridCol w:w="1980"/>
+        <w:gridCol w:w="1980"/>
+        <w:gridCol w:w="1980"/>
+        <w:gridCol w:w="1980"/>
+      </w:tblGrid>
+      <w:tr>
+        <w:trPr>
+          <w:tblHeader w:val="on"/>
+        </w:trPr>
+        <w:tc>
+          <w:tcPr/>
+          <w:p>
+            <w:pPr>
+              <w:pStyle w:val="Compact"/>
+            </w:pPr>
+            <w:r>
+              <w:t xml:space="preserve">Parametre</w:t>
+            </w:r>
+          </w:p>
+        </w:tc>
+        <w:tc>
+          <w:tcPr/>
+          <w:p>
+            <w:pPr>
+              <w:pStyle w:val="Compact"/>
+            </w:pPr>
+            <w:r>
+              <w:t xml:space="preserve">Mevcut</w:t>
+            </w:r>
+          </w:p>
+        </w:tc>
+        <w:tc>
+          <w:tcPr/>
+          <w:p>
+            <w:pPr>
+              <w:pStyle w:val="Compact"/>
+            </w:pPr>
+            <w:r>
+              <w:t xml:space="preserve">Hedef</w:t>
+            </w:r>
+          </w:p>
+        </w:tc>
+        <w:tc>
+          <w:tcPr/>
+          <w:p>
+            <w:pPr>
+              <w:pStyle w:val="Compact"/>
+            </w:pPr>
+            <w:r>
+              <w:t xml:space="preserve">Eylem</w:t>
+            </w:r>
+          </w:p>
+        </w:tc>
+      </w:tr>
+      <w:tr>
+        <w:tc>
+          <w:tcPr/>
+          <w:p>
+            <w:pPr>
+              <w:pStyle w:val="Compact"/>
+            </w:pPr>
+            <w:r>
+              <w:t xml:space="preserve">Warfmadin haftalık doz</w:t>
+            </w:r>
+          </w:p>
+        </w:tc>
+        <w:tc>
+          <w:tcPr/>
+          <w:p>
+            <w:pPr>
+              <w:pStyle w:val="Compact"/>
+            </w:pPr>
+            <w:r>
+              <w:t xml:space="preserve">20 mg/hafta (4 × 5 mg)</w:t>
+            </w:r>
+          </w:p>
+        </w:tc>
+        <w:tc>
+          <w:tcPr/>
+          <w:p>
+            <w:pPr>
+              <w:pStyle w:val="Compact"/>
+            </w:pPr>
+            <w:r>
+              <w:t xml:space="preserve">22.5–25 mg/hafta</w:t>
+            </w:r>
+          </w:p>
+        </w:tc>
+        <w:tc>
+          <w:tcPr/>
+          <w:p>
+            <w:pPr>
+              <w:pStyle w:val="Compact"/>
+            </w:pPr>
+            <w:r>
+              <w:t xml:space="preserve">7 gün boyunca 2.5 mg ek doz veya 5 mg → 7.5 mg bir gün</w:t>
+            </w:r>
+          </w:p>
+        </w:tc>
+      </w:tr>
+      <w:tr>
+        <w:tc>
+          <w:tcPr/>
+          <w:p>
+            <w:pPr>
+              <w:pStyle w:val="Compact"/>
+            </w:pPr>
+            <w:r>
+              <w:t xml:space="preserve">Kontrol INR</w:t>
+            </w:r>
+          </w:p>
+        </w:tc>
+        <w:tc>
+          <w:tcPr/>
+          <w:p>
+            <w:pPr>
+              <w:pStyle w:val="Compact"/>
+            </w:pPr>
+            <w:r>
+              <w:t xml:space="preserve">15.09.2026 (1.95)</w:t>
+            </w:r>
+          </w:p>
+        </w:tc>
+        <w:tc>
+          <w:tcPr/>
+          <w:p>
+            <w:pPr>
+              <w:pStyle w:val="Compact"/>
+            </w:pPr>
+            <w:r>
+              <w:t xml:space="preserve">23–26 Eylül 2026</w:t>
+            </w:r>
+          </w:p>
+        </w:tc>
+        <w:tc>
+          <w:tcPr/>
+          <w:p>
+            <w:pPr>
+              <w:pStyle w:val="Compact"/>
+            </w:pPr>
+            <w:r>
+              <w:t xml:space="preserve">7–10 gün içinde test</w:t>
+            </w:r>
+          </w:p>
+        </w:tc>
+      </w:tr>
+      <w:tr>
+        <w:tc>
+          <w:tcPr/>
+          <w:p>
+            <w:pPr>
+              <w:pStyle w:val="Compact"/>
+            </w:pPr>
+            <w:r>
+              <w:t xml:space="preserve">Diyet</w:t>
+            </w:r>
+          </w:p>
+        </w:tc>
+        <w:tc>
+          <w:tcPr/>
+          <w:p>
+            <w:pPr>
+              <w:pStyle w:val="Compact"/>
+            </w:pPr>
+            <w:r>
+              <w:t xml:space="preserve">Stabil</w:t>
+            </w:r>
+          </w:p>
+        </w:tc>
+        <w:tc>
+          <w:tcPr/>
+          <w:p>
+            <w:pPr>
+              <w:pStyle w:val="Compact"/>
+            </w:pPr>
+            <w:r>
+              <w:t xml:space="preserve">K vitamini stabilizasyonu</w:t>
+            </w:r>
+          </w:p>
+        </w:tc>
+        <w:tc>
+          <w:tcPr/>
+          <w:p>
+            <w:pPr>
+              <w:pStyle w:val="Compact"/>
+            </w:pPr>
+            <w:r>
+              <w:t xml:space="preserve">Ispanak, brokoli, maydanoz porsiyonları sabitlenmeli</w:t>
+            </w:r>
+          </w:p>
+        </w:tc>
+      </w:tr>
+      <w:tr>
+        <w:tc>
+          <w:tcPr/>
+          <w:p>
+            <w:pPr>
+              <w:pStyle w:val="Compact"/>
+            </w:pPr>
+            <w:r>
+              <w:t xml:space="preserve">İlaç uyumu</w:t>
+            </w:r>
+          </w:p>
+        </w:tc>
+        <w:tc>
+          <w:tcPr/>
+          <w:p>
+            <w:pPr>
+              <w:pStyle w:val="Compact"/>
+            </w:pPr>
+            <w:r>
+              <w:t xml:space="preserve">Kontrol edilmeli</w:t>
+            </w:r>
+          </w:p>
+        </w:tc>
+        <w:tc>
+          <w:tcPr/>
+          <w:p>
+            <w:pPr>
+              <w:pStyle w:val="Compact"/>
+            </w:pPr>
+            <w:r>
+              <w:t xml:space="preserve">%100</w:t>
+            </w:r>
+          </w:p>
+        </w:tc>
+        <w:tc>
+          <w:tcPr/>
+          <w:p>
+            <w:pPr>
+              <w:pStyle w:val="Compact"/>
+            </w:pPr>
+            <w:r>
+              <w:t xml:space="preserve">Atlamayan kullanım için hatırlatıcı</w:t>
+            </w:r>
+          </w:p>
+        </w:tc>
+      </w:tr>
+    </w:tbl>
     <w:p>
       <w:r>
         <w:pict>
@@ -2097,15 +2543,6 @@
       <w:pPr>
         <w:pStyle w:val="Heading2"/>
       </w:pPr>
-      <w:r>
-        <w:rPr>
-          <w:rStyle w:val="SectionNumber"/>
-        </w:rPr>
-        <w:t xml:space="preserve">1.5</w:t>
-      </w:r>
-      <w:r>
-        <w:tab/>
-      </w:r>
       <w:r>
         <w:t xml:space="preserve">4. Tümleşik Master Tablo — 32 Parametrelik Biyobelirteç Audit</w:t>
       </w:r>
@@ -2192,7 +2629,7 @@
               <w:pStyle w:val="Compact"/>
             </w:pPr>
             <w:r>
-              <w:t xml:space="preserve">Son (15.09)</w:t>
+              <w:t xml:space="preserve">Son (15.09 #93 / 08.09 #90)</w:t>
             </w:r>
           </w:p>
         </w:tc>
@@ -2308,7 +2745,7 @@
               <w:pStyle w:val="Compact"/>
             </w:pPr>
             <w:r>
-              <w:t xml:space="preserve">Vahanian et al. (2022)</w:t>
+              <w:t xml:space="preserve">Praz et al. (2025); Vahanian et al. (2022)</w:t>
             </w:r>
           </w:p>
         </w:tc>
@@ -2402,7 +2839,7 @@
               <w:pStyle w:val="Compact"/>
             </w:pPr>
             <w:r>
-              <w:t xml:space="preserve">Vahanian et al. (2022)</w:t>
+              <w:t xml:space="preserve">Praz et al. (2025); Vahanian et al. (2022)</w:t>
             </w:r>
           </w:p>
         </w:tc>
@@ -2496,7 +2933,7 @@
               <w:pStyle w:val="Compact"/>
             </w:pPr>
             <w:r>
-              <w:t xml:space="preserve">Vahanian et al. (2022)</w:t>
+              <w:t xml:space="preserve">Praz et al. (2025); Vahanian et al. (2022)</w:t>
             </w:r>
           </w:p>
         </w:tc>
@@ -3460,7 +3897,7 @@
               <w:pStyle w:val="Compact"/>
             </w:pPr>
             <w:r>
-              <w:t xml:space="preserve">Ferritin</w:t>
+              <w:t xml:space="preserve">Ferritin (08.09 #90)</w:t>
             </w:r>
           </w:p>
         </w:tc>
@@ -3554,7 +3991,7 @@
               <w:pStyle w:val="Compact"/>
             </w:pPr>
             <w:r>
-              <w:t xml:space="preserve">Serum Demir (Fe)</w:t>
+              <w:t xml:space="preserve">Serum Demir (Fe 08.09 #90)</w:t>
             </w:r>
           </w:p>
         </w:tc>
@@ -3648,7 +4085,7 @@
               <w:pStyle w:val="Compact"/>
             </w:pPr>
             <w:r>
-              <w:t xml:space="preserve">UIBC</w:t>
+              <w:t xml:space="preserve">UIBC (08.09 #90)</w:t>
             </w:r>
           </w:p>
         </w:tc>
@@ -3812,7 +4249,7 @@
               <w:pStyle w:val="Compact"/>
             </w:pPr>
             <w:r>
-              <w:t xml:space="preserve">Vahanian et al. (2022)</w:t>
+              <w:t xml:space="preserve">Praz et al. (2025); Vahanian et al. (2022)</w:t>
             </w:r>
           </w:p>
         </w:tc>
@@ -4964,7 +5401,7 @@
               <w:pStyle w:val="Compact"/>
             </w:pPr>
             <w:r>
-              <w:t xml:space="preserve">LDL Kolesterol</w:t>
+              <w:t xml:space="preserve">LDL Kolesterol (08.09 #90)</w:t>
             </w:r>
           </w:p>
         </w:tc>
@@ -5058,7 +5495,7 @@
               <w:pStyle w:val="Compact"/>
             </w:pPr>
             <w:r>
-              <w:t xml:space="preserve">Total Kolesterol</w:t>
+              <w:t xml:space="preserve">Total Kolesterol (08.09 #90)</w:t>
             </w:r>
           </w:p>
         </w:tc>
@@ -5152,7 +5589,7 @@
               <w:pStyle w:val="Compact"/>
             </w:pPr>
             <w:r>
-              <w:t xml:space="preserve">TSH</w:t>
+              <w:t xml:space="preserve">TSH (08.09 #90)</w:t>
             </w:r>
           </w:p>
         </w:tc>
@@ -5200,7 +5637,7 @@
                 <w:b/>
                 <w:bCs/>
               </w:rPr>
-              <w:t xml:space="preserve">0.28</w:t>
+              <w:t xml:space="preserve">0.279</w:t>
             </w:r>
           </w:p>
         </w:tc>
@@ -5233,15 +5670,6 @@
       <w:pPr>
         <w:pStyle w:val="Heading3"/>
       </w:pPr>
-      <w:r>
-        <w:rPr>
-          <w:rStyle w:val="SectionNumber"/>
-        </w:rPr>
-        <w:t xml:space="preserve">1.5.1</w:t>
-      </w:r>
-      <w:r>
-        <w:tab/>
-      </w:r>
       <w:r>
         <w:t xml:space="preserve">4.1. Trend Analizi ve Kritik Yorumlar</w:t>
       </w:r>
@@ -5265,7 +5693,19 @@
         <w:t xml:space="preserve"> </w:t>
       </w:r>
       <w:r>
-        <w:t xml:space="preserve">Kalıcı mikrositer anemi (MCV 76.7 fL), demir depolarının tamamen boşaldığını ve RDW genişlemesinin (18.2%) kronik demir eksikliği paternini doğruladığını gösterir (Camaschella, 2015).</w:t>
+        <w:t xml:space="preserve">Kalıcı mikrositer anemi (MCV 76.7 fL), demir depolarının tamamen boşaldığını (Ferritin 19</w:t>
+      </w:r>
+      <w:r>
+        <w:t xml:space="preserve"> </w:t>
+      </w:r>
+      <w:r>
+        <w:t xml:space="preserve">µg/L, Fe 15 µg/dL, UIBC 326.8 µg/dL) ve RDW genişlemesinin (18.2%) kronik demir eksikliği paternini doğruladığını</w:t>
+      </w:r>
+      <w:r>
+        <w:t xml:space="preserve"> </w:t>
+      </w:r>
+      <w:r>
+        <w:t xml:space="preserve">gösterir (Camaschella, 2015).</w:t>
       </w:r>
     </w:p>
     <w:p>
@@ -5287,7 +5727,13 @@
         <w:t xml:space="preserve"> </w:t>
       </w:r>
       <w:r>
-        <w:t xml:space="preserve">PLT 368 ×10⁹/L değeri, postoperatif inflamatuvar rebound ve demir eksikliği anemisinin reaktif trombositozu olarak yorumlanabilir (Snook et al., 2021).</w:t>
+        <w:t xml:space="preserve">PLT 368 ×10⁹/L değeri, postoperatif inflamatuvar rebound ve demir eksikliği anemisinin reaktif</w:t>
+      </w:r>
+      <w:r>
+        <w:t xml:space="preserve"> </w:t>
+      </w:r>
+      <w:r>
+        <w:t xml:space="preserve">trombositozu olarak yorumlanabilir (Snook et al., 2021).</w:t>
       </w:r>
     </w:p>
     <w:p>
@@ -5309,7 +5755,13 @@
         <w:t xml:space="preserve"> </w:t>
       </w:r>
       <w:r>
-        <w:t xml:space="preserve">154 → 5.7 mg/L gerileme, Klamoks kürüne tam yanıt veren subakut yara enfeksiyonunun kontrol altına alındığını gösterir (Horan et al., 2008).</w:t>
+        <w:t xml:space="preserve">154 → 5.7 mg/L gerileme, Klamoks kürüne tam yanıt veren subakut yara enfeksiyonunun kontrol altına alındığını</w:t>
+      </w:r>
+      <w:r>
+        <w:t xml:space="preserve"> </w:t>
+      </w:r>
+      <w:r>
+        <w:t xml:space="preserve">gösterir (Horan et al., 2008).</w:t>
       </w:r>
     </w:p>
     <w:p>
@@ -5331,7 +5783,13 @@
         <w:t xml:space="preserve"> </w:t>
       </w:r>
       <w:r>
-        <w:t xml:space="preserve">Coversyl (ACEi) ve böbrek fonksiyonları birlikte izlenmeli; sınır üst banda yaklaşılmıştır (KDIGO, 2013).</w:t>
+        <w:t xml:space="preserve">Coversyl (ACEi) ve böbrek fonksiyonları birlikte izlenmeli; sınır üst banda yaklaşılmıştır</w:t>
+      </w:r>
+      <w:r>
+        <w:t xml:space="preserve"> </w:t>
+      </w:r>
+      <w:r>
+        <w:t xml:space="preserve">(KDIGO, 2013).</w:t>
       </w:r>
     </w:p>
     <w:p>
@@ -5353,7 +5811,13 @@
         <w:t xml:space="preserve"> </w:t>
       </w:r>
       <w:r>
-        <w:t xml:space="preserve">ESC 2024 çok yüksek risk kategorisi için hedef &lt;55 mg/dL'dir; statin endikasyonu doğmuştur (Mach et al., 2020).</w:t>
+        <w:t xml:space="preserve">ESC 2024 çok yüksek risk kategorisi için hedef &lt;55 mg/dL'dir; statin endikasyonu doğmuştur (Mach et</w:t>
+      </w:r>
+      <w:r>
+        <w:t xml:space="preserve"> </w:t>
+      </w:r>
+      <w:r>
+        <w:t xml:space="preserve">al., 2020).</w:t>
       </w:r>
     </w:p>
     <w:p>
@@ -5365,22 +5829,13 @@
     </w:p>
     <w:bookmarkEnd w:id="21"/>
     <w:bookmarkEnd w:id="22"/>
-    <w:bookmarkStart w:id="25" w:name="X7cc688e6dced6843ef9338756764910772575b9"/>
+    <w:bookmarkStart w:id="25" w:name="X005a6c34fa725e521985f059387962bbc47c656"/>
     <w:p>
       <w:pPr>
         <w:pStyle w:val="Heading2"/>
       </w:pPr>
       <w:r>
-        <w:rPr>
-          <w:rStyle w:val="SectionNumber"/>
-        </w:rPr>
-        <w:t xml:space="preserve">1.6</w:t>
-      </w:r>
-      <w:r>
-        <w:tab/>
-      </w:r>
-      <w:r>
-        <w:t xml:space="preserve">5. Güncel Farmakoterapi ve 5 Maddelik Branş Eylem Planı</w:t>
+        <w:t xml:space="preserve">5. Güncel Farmakoterapi ve 5 Maddelik Cerrahi Öncelikli Branş Eylem Planı</w:t>
       </w:r>
     </w:p>
     <w:bookmarkStart w:id="23" w:name="X9a1e1fd63ccdd332bf6a538ddd1e10de035ea4b"/>
@@ -5388,15 +5843,6 @@
       <w:pPr>
         <w:pStyle w:val="Heading3"/>
       </w:pPr>
-      <w:r>
-        <w:rPr>
-          <w:rStyle w:val="SectionNumber"/>
-        </w:rPr>
-        <w:t xml:space="preserve">1.6.1</w:t>
-      </w:r>
-      <w:r>
-        <w:tab/>
-      </w:r>
       <w:r>
         <w:t xml:space="preserve">5.1. Aktif İlaç Rejimi (16.09.2026)</w:t>
       </w:r>
@@ -5921,22 +6367,13 @@
       </w:tr>
     </w:tbl>
     <w:bookmarkEnd w:id="23"/>
-    <w:bookmarkStart w:id="24" w:name="Xcd3364d0e16e18725d8d1ec7af0ea715ddc9a02"/>
+    <w:bookmarkStart w:id="24" w:name="X89291bbdc5d29f4a51d4171fc9826ce616147b4"/>
     <w:p>
       <w:pPr>
         <w:pStyle w:val="Heading3"/>
       </w:pPr>
       <w:r>
-        <w:rPr>
-          <w:rStyle w:val="SectionNumber"/>
-        </w:rPr>
-        <w:t xml:space="preserve">1.6.2</w:t>
-      </w:r>
-      <w:r>
-        <w:tab/>
-      </w:r>
-      <w:r>
-        <w:t xml:space="preserve">5.2. Branş Bazlı 5 Maddelik Eylem Planı</w:t>
+        <w:t xml:space="preserve">5.2. Cerrahi Öncelikli 5 Maddelik Eylem Planı</w:t>
       </w:r>
     </w:p>
     <w:p>
@@ -5994,7 +6431,13 @@
         <w:t xml:space="preserve"> </w:t>
       </w:r>
       <w:r>
-        <w:t xml:space="preserve">için randevu planlanacak (Czerny et al., 2024; Fleischmann et al., 2022)</w:t>
+        <w:t xml:space="preserve">için randevu planlanacak (Czerny et al., 2024; Fleischmann et al.,</w:t>
+      </w:r>
+      <w:r>
+        <w:t xml:space="preserve"> </w:t>
+      </w:r>
+      <w:r>
+        <w:t xml:space="preserve">2022)</w:t>
       </w:r>
     </w:p>
     <w:p>
@@ -6042,7 +6485,13 @@
         </w:numPr>
       </w:pPr>
       <w:r>
-        <w:t xml:space="preserve">Ferro Sanol Duodenal 100 mg devam; 4 hafta sonra HGB yanıtı değerlendirilecek (hedef ≥1 g/dL artış) (Snook et al., 2021)</w:t>
+        <w:t xml:space="preserve">Ferro Sanol Duodenal 100 mg devam; 4 hafta sonra HGB yanıtı değerlendirilecek (hedef ≥1 g/dL artış) (Snook et al.,</w:t>
+      </w:r>
+      <w:r>
+        <w:t xml:space="preserve"> </w:t>
+      </w:r>
+      <w:r>
+        <w:t xml:space="preserve">2021)</w:t>
       </w:r>
     </w:p>
     <w:p>
@@ -6082,7 +6531,7 @@
         </w:numPr>
       </w:pPr>
       <w:r>
-        <w:t xml:space="preserve">Ardışık 3× GGK + üst GİS endoskopi ve kolonoskopi planı (Goddard et al., 2021)</w:t>
+        <w:t xml:space="preserve">Ardışık 3× GGK + üst GİS endoskopi ve kolonoskopi planı (Goddard et al., 2011)</w:t>
       </w:r>
     </w:p>
     <w:p>
@@ -6158,7 +6607,7 @@
         </w:numPr>
       </w:pPr>
       <w:r>
-        <w:t xml:space="preserve">Tansiyon 113/75 mmHg hedef bandı sürdürülecek (McEvoy et al., 2024)</w:t>
+        <w:t xml:space="preserve">Tansiyon 113/76 mmHg hedef bandı sürdürülecek (McEvoy et al., 2024)</w:t>
       </w:r>
     </w:p>
     <w:p>
@@ -6282,20 +6731,11 @@
     </w:p>
     <w:bookmarkEnd w:id="24"/>
     <w:bookmarkEnd w:id="25"/>
-    <w:bookmarkStart w:id="46" w:name="Xb50c720da11a2eaf10decf0df50b426950be628"/>
+    <w:bookmarkStart w:id="47" w:name="Xb50c720da11a2eaf10decf0df50b426950be628"/>
     <w:p>
       <w:pPr>
         <w:pStyle w:val="Heading2"/>
       </w:pPr>
-      <w:r>
-        <w:rPr>
-          <w:rStyle w:val="SectionNumber"/>
-        </w:rPr>
-        <w:t xml:space="preserve">1.7</w:t>
-      </w:r>
-      <w:r>
-        <w:tab/>
-      </w:r>
       <w:r>
         <w:t xml:space="preserve">6. Kaynakça (APA 7th Edition)</w:t>
       </w:r>
@@ -6331,7 +6771,13 @@
         <w:t xml:space="preserve">372</w:t>
       </w:r>
       <w:r>
-        <w:t xml:space="preserve">(19), 1832–1843.</w:t>
+        <w:t xml:space="preserve">(19),</w:t>
+      </w:r>
+      <w:r>
+        <w:t xml:space="preserve"> </w:t>
+      </w:r>
+      <w:r>
+        <w:t xml:space="preserve">1832–1843.</w:t>
       </w:r>
       <w:r>
         <w:t xml:space="preserve"> </w:t>
@@ -6350,7 +6796,19 @@
         <w:pStyle w:val="BodyText"/>
       </w:pPr>
       <w:r>
-        <w:t xml:space="preserve">Czerny, M., Grabenwöger, M., Berger, T., Aboyans, V., Della Corte, A., Jassar, A. S., Kallenbach, K., Misfeld, M., Trimarchi, S., &amp; EACTS/STS Scientific Document Group. (2024). EACTS/STS Guidelines for diagnosing and treating acute and chronic syndromes of the aortic organ.</w:t>
+        <w:t xml:space="preserve">Czerny, M., Grabenwöger, M., Berger, T., Aboyans, V., Della Corte, A., Jassar, A. S., Kallenbach, K., Misfeld, M.,</w:t>
+      </w:r>
+      <w:r>
+        <w:t xml:space="preserve"> </w:t>
+      </w:r>
+      <w:r>
+        <w:t xml:space="preserve">Trimarchi, S., &amp; EACTS/STS Scientific Document Group. (2024). EACTS/STS Guidelines for diagnosing and treating acute and</w:t>
+      </w:r>
+      <w:r>
+        <w:t xml:space="preserve"> </w:t>
+      </w:r>
+      <w:r>
+        <w:t xml:space="preserve">chronic syndromes of the aortic organ.</w:t>
       </w:r>
       <w:r>
         <w:t xml:space="preserve"> </w:t>
@@ -6376,7 +6834,13 @@
         <w:t xml:space="preserve">65</w:t>
       </w:r>
       <w:r>
-        <w:t xml:space="preserve">(2), Article ezad426.</w:t>
+        <w:t xml:space="preserve">(2), Article</w:t>
+      </w:r>
+      <w:r>
+        <w:t xml:space="preserve"> </w:t>
+      </w:r>
+      <w:r>
+        <w:t xml:space="preserve">ezad426.</w:t>
       </w:r>
       <w:r>
         <w:t xml:space="preserve"> </w:t>
@@ -6395,7 +6859,25 @@
         <w:pStyle w:val="BodyText"/>
       </w:pPr>
       <w:r>
-        <w:t xml:space="preserve">Delgado, V., Ajmone Marsan, N., de Waha, S., Bonaros, N., Brida, M., Burri, H., Caselli, S., Doenst, T., Durante-Mangoni, E., Erba, P. A., Frank, D., Gallardo, E., Galiè, N., Habib, G., Lancellotti, P., Lionetti, G., Mancone, M., Mistiaen, W., Nienaber, C. A., … ESC Scientific Document Group. (2023). 2023 ESC Guidelines for the management of endocarditis.</w:t>
+        <w:t xml:space="preserve">Delgado, V., Ajmone Marsan, N., de Waha, S., Bonaros, N., Brida, M., Burri, H., Caselli, S., Doenst, T.,</w:t>
+      </w:r>
+      <w:r>
+        <w:t xml:space="preserve"> </w:t>
+      </w:r>
+      <w:r>
+        <w:t xml:space="preserve">Durante-Mangoni, E., Erba, P. A., Frank, D., Gallardo, E., Galiè, N., Habib, G., Lancellotti, P., Lionetti, G., Mancone,</w:t>
+      </w:r>
+      <w:r>
+        <w:t xml:space="preserve"> </w:t>
+      </w:r>
+      <w:r>
+        <w:t xml:space="preserve">M., Mistiaen, W., Nienaber, C. A., … ESC Scientific Document Group. (2023). 2023 ESC Guidelines for the management of</w:t>
+      </w:r>
+      <w:r>
+        <w:t xml:space="preserve"> </w:t>
+      </w:r>
+      <w:r>
+        <w:t xml:space="preserve">endocarditis.</w:t>
       </w:r>
       <w:r>
         <w:t xml:space="preserve"> </w:t>
@@ -6440,7 +6922,25 @@
         <w:pStyle w:val="BodyText"/>
       </w:pPr>
       <w:r>
-        <w:t xml:space="preserve">Fleischmann, D., Afifi, R. O., Casanegra, A. I., Elefteriades, J. A., Gleason, T. G., Hanneman, K., Hope, M. D., Hughes, G. C., Matsumura, J. S., Rylski, B., Trimarchi, S., &amp; American Heart Association Council on Cardiovascular Radiology and Intervention. (2022). Imaging and surveillance of chronic aortic dissection: A scientific statement from the American Heart Association.</w:t>
+        <w:t xml:space="preserve">Fleischmann, D., Afifi, R. O., Casanegra, A. I., Elefteriades, J. A., Gleason, T. G., Hanneman, K., Hope, M. D., Hughes,</w:t>
+      </w:r>
+      <w:r>
+        <w:t xml:space="preserve"> </w:t>
+      </w:r>
+      <w:r>
+        <w:t xml:space="preserve">G. C., Matsumura, J. S., Rylski, B., Trimarchi, S., &amp; American Heart Association Council on Cardiovascular Radiology and</w:t>
+      </w:r>
+      <w:r>
+        <w:t xml:space="preserve"> </w:t>
+      </w:r>
+      <w:r>
+        <w:t xml:space="preserve">Intervention. (2022). Imaging and surveillance of chronic aortic dissection: A scientific statement from the American</w:t>
+      </w:r>
+      <w:r>
+        <w:t xml:space="preserve"> </w:t>
+      </w:r>
+      <w:r>
+        <w:t xml:space="preserve">Heart Association.</w:t>
       </w:r>
       <w:r>
         <w:t xml:space="preserve"> </w:t>
@@ -6466,7 +6966,13 @@
         <w:t xml:space="preserve">15</w:t>
       </w:r>
       <w:r>
-        <w:t xml:space="preserve">(3), Article e000075.</w:t>
+        <w:t xml:space="preserve">(3), Article</w:t>
+      </w:r>
+      <w:r>
+        <w:t xml:space="preserve"> </w:t>
+      </w:r>
+      <w:r>
+        <w:t xml:space="preserve">e000075.</w:t>
       </w:r>
       <w:r>
         <w:t xml:space="preserve"> </w:t>
@@ -6485,7 +6991,13 @@
         <w:pStyle w:val="BodyText"/>
       </w:pPr>
       <w:r>
-        <w:t xml:space="preserve">Goddard, A. F., James, M. W., McIntyre, A. S., &amp; Scott, B. B. (2021). Guidelines for the management of iron deficiency anaemia.</w:t>
+        <w:t xml:space="preserve">Goddard, A. F., James, M. W., McIntyre, A. S., &amp; Scott, B. B. (2011). Guidelines for the management of iron deficiency</w:t>
+      </w:r>
+      <w:r>
+        <w:t xml:space="preserve"> </w:t>
+      </w:r>
+      <w:r>
+        <w:t xml:space="preserve">anaemia.</w:t>
       </w:r>
       <w:r>
         <w:t xml:space="preserve"> </w:t>
@@ -6530,7 +7042,13 @@
         <w:pStyle w:val="BodyText"/>
       </w:pPr>
       <w:r>
-        <w:t xml:space="preserve">Horan, T. C., Andrus, M., &amp; Dudeck, M. A. (2008). CDC/NHSN surveillance definition of health care-associated infection and criteria for specific types of infections in the acute care setting.</w:t>
+        <w:t xml:space="preserve">Horan, T. C., Andrus, M., &amp; Dudeck, M. A. (2008). CDC/NHSN surveillance definition of health care-associated infection</w:t>
+      </w:r>
+      <w:r>
+        <w:t xml:space="preserve"> </w:t>
+      </w:r>
+      <w:r>
+        <w:t xml:space="preserve">and criteria for specific types of infections in the acute care setting.</w:t>
       </w:r>
       <w:r>
         <w:t xml:space="preserve"> </w:t>
@@ -6554,6 +7072,9 @@
           <w:iCs/>
         </w:rPr>
         <w:t xml:space="preserve">36</w:t>
+      </w:r>
+      <w:r>
+        <w:t xml:space="preserve"> </w:t>
       </w:r>
       <w:r>
         <w:t xml:space="preserve">(5), 309–332.</w:t>
@@ -6575,7 +7096,25 @@
         <w:pStyle w:val="BodyText"/>
       </w:pPr>
       <w:r>
-        <w:t xml:space="preserve">Inker, L. A., Eneanya, N. D., Coresh, J., Tighiouart, H., Wang, D., Sang, Y., Crews, D. C., Doria, A., Estrella, M. M., Froissart, M., Grams, M. E., Greene, T., Grubb, A., Gudnason, V., Gutiérrez, O. M., Kalil, R., Karger, A. B., Mauer, M., Navis, G., … Chronic Kidney Disease Epidemiology Collaboration. (2021). New creatinine- and cystatin C–based equations to estimate GFR without race.</w:t>
+        <w:t xml:space="preserve">Inker, L. A., Eneanya, N. D., Coresh, J., Tighiouart, H., Wang, D., Sang, Y., Crews, D. C., Doria, A., Estrella, M. M.,</w:t>
+      </w:r>
+      <w:r>
+        <w:t xml:space="preserve"> </w:t>
+      </w:r>
+      <w:r>
+        <w:t xml:space="preserve">Froissart, M., Grams, M. E., Greene, T., Grubb, A., Gudnason, V., Gutiérrez, O. M., Kalil, R., Karger, A. B., Mauer, M.,</w:t>
+      </w:r>
+      <w:r>
+        <w:t xml:space="preserve"> </w:t>
+      </w:r>
+      <w:r>
+        <w:t xml:space="preserve">Navis, G., … Chronic Kidney Disease Epidemiology Collaboration. (2021). New creatinine- and cystatin C–based equations</w:t>
+      </w:r>
+      <w:r>
+        <w:t xml:space="preserve"> </w:t>
+      </w:r>
+      <w:r>
+        <w:t xml:space="preserve">to estimate GFR without race.</w:t>
       </w:r>
       <w:r>
         <w:t xml:space="preserve"> </w:t>
@@ -6601,7 +7140,13 @@
         <w:t xml:space="preserve">385</w:t>
       </w:r>
       <w:r>
-        <w:t xml:space="preserve">(19), 1737–1749.</w:t>
+        <w:t xml:space="preserve">(19),</w:t>
+      </w:r>
+      <w:r>
+        <w:t xml:space="preserve"> </w:t>
+      </w:r>
+      <w:r>
+        <w:t xml:space="preserve">1737–1749.</w:t>
       </w:r>
       <w:r>
         <w:t xml:space="preserve"> </w:t>
@@ -6620,7 +7165,25 @@
         <w:pStyle w:val="BodyText"/>
       </w:pPr>
       <w:r>
-        <w:t xml:space="preserve">Isselbacher, E. M., Preventza, O., Hamilton Black, J., 3rd, Augoustides, J. G., Beck, A. W., Bolen, M. A., Braverman, A. C., Bray, B. E., Browne, M. M., Collins, J. D., Coselli, J. S., Desai, N. D., Fischbein, M. P., Gornik, H. L., Hornick, M. A., Huang, C. C., Johnston, W. F., Kelly, R. F., Klingensmith, N. J., … ACC/AHA Joint Committee on Clinical Practice Guidelines. (2022). 2022 ACC/AHA Guideline for the diagnosis and management of aortic disease.</w:t>
+        <w:t xml:space="preserve">Isselbacher, E. M., Preventza, O., Hamilton Black, J., 3rd, Augoustides, J. G., Beck, A. W., Bolen, M. A., Braverman, A.</w:t>
+      </w:r>
+      <w:r>
+        <w:t xml:space="preserve"> </w:t>
+      </w:r>
+      <w:r>
+        <w:t xml:space="preserve">C., Bray, B. E., Browne, M. M., Collins, J. D., Coselli, J. S., Desai, N. D., Fischbein, M. P., Gornik, H. L., Hornick,</w:t>
+      </w:r>
+      <w:r>
+        <w:t xml:space="preserve"> </w:t>
+      </w:r>
+      <w:r>
+        <w:t xml:space="preserve">M. A., Huang, C. C., Johnston, W. F., Kelly, R. F., Klingensmith, N. J., … ACC/AHA Joint Committee on Clinical Practice</w:t>
+      </w:r>
+      <w:r>
+        <w:t xml:space="preserve"> </w:t>
+      </w:r>
+      <w:r>
+        <w:t xml:space="preserve">Guidelines. (2022). 2022 ACC/AHA Guideline for the diagnosis and management of aortic disease.</w:t>
       </w:r>
       <w:r>
         <w:t xml:space="preserve"> </w:t>
@@ -6646,7 +7209,13 @@
         <w:t xml:space="preserve">146</w:t>
       </w:r>
       <w:r>
-        <w:t xml:space="preserve">(24), e334–e482.</w:t>
+        <w:t xml:space="preserve">(24),</w:t>
+      </w:r>
+      <w:r>
+        <w:t xml:space="preserve"> </w:t>
+      </w:r>
+      <w:r>
+        <w:t xml:space="preserve">e334–e482.</w:t>
       </w:r>
       <w:r>
         <w:t xml:space="preserve"> </w:t>
@@ -6691,6 +7260,9 @@
         <w:t xml:space="preserve">12</w:t>
       </w:r>
       <w:r>
+        <w:t xml:space="preserve"> </w:t>
+      </w:r>
+      <w:r>
         <w:t xml:space="preserve">(1), Article 94.</w:t>
       </w:r>
       <w:r>
@@ -6710,7 +7282,13 @@
         <w:pStyle w:val="BodyText"/>
       </w:pPr>
       <w:r>
-        <w:t xml:space="preserve">KDIGO CKD Work Group. (2013). KDIGO 2012 clinical practice guideline for the evaluation and management of chronic kidney disease.</w:t>
+        <w:t xml:space="preserve">KDIGO CKD Work Group. (2013). KDIGO 2012 clinical practice guideline for the evaluation and management of chronic kidney</w:t>
+      </w:r>
+      <w:r>
+        <w:t xml:space="preserve"> </w:t>
+      </w:r>
+      <w:r>
+        <w:t xml:space="preserve">disease.</w:t>
       </w:r>
       <w:r>
         <w:t xml:space="preserve"> </w:t>
@@ -6755,7 +7333,19 @@
         <w:pStyle w:val="BodyText"/>
       </w:pPr>
       <w:r>
-        <w:t xml:space="preserve">Lau, C., Gregg, A., Ram, E., Mack, C. A., Krieger, K., Rahouma, M., Gambardella, I., Soletti, G., Jr., Gaudino, M., &amp; Girardi, L. N. (2025). Long-term survival and operative outcomes of the Bentall procedure for aortic root aneurysm, aortic dissection, and endocarditis.</w:t>
+        <w:t xml:space="preserve">Lau, C., Gregg, A., Ram, E., Mack, C. A., Krieger, K., Rahouma, M., Gambardella, I., Soletti, G., Jr., Gaudino, M., &amp;</w:t>
+      </w:r>
+      <w:r>
+        <w:t xml:space="preserve"> </w:t>
+      </w:r>
+      <w:r>
+        <w:t xml:space="preserve">Girardi, L. N. (2025). Long-term survival and operative outcomes of the Bentall procedure for aortic root aneurysm,</w:t>
+      </w:r>
+      <w:r>
+        <w:t xml:space="preserve"> </w:t>
+      </w:r>
+      <w:r>
+        <w:t xml:space="preserve">aortic dissection, and endocarditis.</w:t>
       </w:r>
       <w:r>
         <w:t xml:space="preserve"> </w:t>
@@ -6768,7 +7358,13 @@
         <w:t xml:space="preserve">The Journal of Thoracic and Cardiovascular Surgery</w:t>
       </w:r>
       <w:r>
-        <w:t xml:space="preserve">. Advance online publication.</w:t>
+        <w:t xml:space="preserve">. Advance online</w:t>
+      </w:r>
+      <w:r>
+        <w:t xml:space="preserve"> </w:t>
+      </w:r>
+      <w:r>
+        <w:t xml:space="preserve">publication.</w:t>
       </w:r>
       <w:r>
         <w:t xml:space="preserve"> </w:t>
@@ -6787,7 +7383,25 @@
         <w:pStyle w:val="BodyText"/>
       </w:pPr>
       <w:r>
-        <w:t xml:space="preserve">Mach, F., Baigent, C., Catapano, A. L., Koskinas, K. C., Casula, M., Badimon, L., Chapman, M. J., De Backer, G. G., Delgado, V., Ference, B. A., Graham, I. M., Taskinen, M. R., Tokgözoğlu, L., Vardas, P. E., &amp; ESC Scientific Document Group. (2020). 2019 ESC/EAS Guidelines for the management of dyslipidaemias: Lipid modification to reduce cardiovascular risk.</w:t>
+        <w:t xml:space="preserve">Mach, F., Baigent, C., Catapano, A. L., Koskinas, K. C., Casula, M., Badimon, L., Chapman, M. J., De Backer, G. G.,</w:t>
+      </w:r>
+      <w:r>
+        <w:t xml:space="preserve"> </w:t>
+      </w:r>
+      <w:r>
+        <w:t xml:space="preserve">Delgado, V., Ference, B. A., Graham, I. M., Taskinen, M. R., Tokgözoğlu, L., Vardas, P. E., &amp; ESC Scientific Document</w:t>
+      </w:r>
+      <w:r>
+        <w:t xml:space="preserve"> </w:t>
+      </w:r>
+      <w:r>
+        <w:t xml:space="preserve">Group. (2020). 2019 ESC/EAS Guidelines for the management of dyslipidaemias: Lipid modification to reduce cardiovascular</w:t>
+      </w:r>
+      <w:r>
+        <w:t xml:space="preserve"> </w:t>
+      </w:r>
+      <w:r>
+        <w:t xml:space="preserve">risk.</w:t>
       </w:r>
       <w:r>
         <w:t xml:space="preserve"> </w:t>
@@ -6832,7 +7446,25 @@
         <w:pStyle w:val="BodyText"/>
       </w:pPr>
       <w:r>
-        <w:t xml:space="preserve">Mancia, G., Kreutz, R., Brunström, M., Burnier, M., Grassi, G., Januszewicz, A., Muiesan, M. L., Tsioufis, K., Agabiti-Rosei, E., Azizi, M., Benetos, A., Borghi, C., Erdine, S., Gerdts, E., Kahan, T., Konradi, A., Coca, A., McManus, R., Parati, G., … ESH Scientific Council. (2023). 2023 ESH Guidelines for the management of arterial hypertension.</w:t>
+        <w:t xml:space="preserve">Mancia, G., Kreutz, R., Brunström, M., Burnier, M., Grassi, G., Januszewicz, A., Muiesan, M. L., Tsioufis, K.,</w:t>
+      </w:r>
+      <w:r>
+        <w:t xml:space="preserve"> </w:t>
+      </w:r>
+      <w:r>
+        <w:t xml:space="preserve">Agabiti-Rosei, E., Azizi, M., Benetos, A., Borghi, C., Erdine, S., Gerdts, E., Kahan, T., Konradi, A., Coca, A.,</w:t>
+      </w:r>
+      <w:r>
+        <w:t xml:space="preserve"> </w:t>
+      </w:r>
+      <w:r>
+        <w:t xml:space="preserve">McManus, R., Parati, G., … ESH Scientific Council. (2023). 2023 ESH Guidelines for the management of arterial</w:t>
+      </w:r>
+      <w:r>
+        <w:t xml:space="preserve"> </w:t>
+      </w:r>
+      <w:r>
+        <w:t xml:space="preserve">hypertension.</w:t>
       </w:r>
       <w:r>
         <w:t xml:space="preserve"> </w:t>
@@ -6877,7 +7509,25 @@
         <w:pStyle w:val="BodyText"/>
       </w:pPr>
       <w:r>
-        <w:t xml:space="preserve">McDonagh, T. A., Metra, M., Adamo, M., Gardner, R. S., Baumbach, A., Böhm, M., Burri, H., Butler, J., Čelutkienė, J., Chioncel, O., Cleland, J. G. F., Coats, A. J. S., Crespo-Leiro, M. G., Farmakis, D., Gilard, M., Heymans, S., Hoes, A. W., Jaarsma, T., Jankowska, E. A., … ESC Scientific Document Group. (2021). 2021 ESC Guidelines for the diagnosis and treatment of acute and chronic heart failure.</w:t>
+        <w:t xml:space="preserve">McDonagh, T. A., Metra, M., Adamo, M., Gardner, R. S., Baumbach, A., Böhm, M., Burri, H., Butler, J., Čelutkienė, J.,</w:t>
+      </w:r>
+      <w:r>
+        <w:t xml:space="preserve"> </w:t>
+      </w:r>
+      <w:r>
+        <w:t xml:space="preserve">Chioncel, O., Cleland, J. G. F., Coats, A. J. S., Crespo-Leiro, M. G., Farmakis, D., Gilard, M., Heymans, S., Hoes, A.</w:t>
+      </w:r>
+      <w:r>
+        <w:t xml:space="preserve"> </w:t>
+      </w:r>
+      <w:r>
+        <w:t xml:space="preserve">W., Jaarsma, T., Jankowska, E. A., … ESC Scientific Document Group. (2021). 2021 ESC Guidelines for the diagnosis and</w:t>
+      </w:r>
+      <w:r>
+        <w:t xml:space="preserve"> </w:t>
+      </w:r>
+      <w:r>
+        <w:t xml:space="preserve">treatment of acute and chronic heart failure.</w:t>
       </w:r>
       <w:r>
         <w:t xml:space="preserve"> </w:t>
@@ -6903,7 +7553,13 @@
         <w:t xml:space="preserve">42</w:t>
       </w:r>
       <w:r>
-        <w:t xml:space="preserve">(36), 3599–3726.</w:t>
+        <w:t xml:space="preserve">(36),</w:t>
+      </w:r>
+      <w:r>
+        <w:t xml:space="preserve"> </w:t>
+      </w:r>
+      <w:r>
+        <w:t xml:space="preserve">3599–3726.</w:t>
       </w:r>
       <w:r>
         <w:t xml:space="preserve"> </w:t>
@@ -6922,7 +7578,25 @@
         <w:pStyle w:val="BodyText"/>
       </w:pPr>
       <w:r>
-        <w:t xml:space="preserve">McEvoy, J. W., McCarthy, C. P., Bruno, R. M., Brouwers, S., Canavan, M., Ceconi, C., Christodorescu, R. M., D'Agostino, R. B., Sr., de Simone, G., Ferro, C. J., Gevaert, S., Jordan, J., Kahan, T., Mahfoud, F., McManus, R. J., Moran, A. E., Narkiewicz, K., Nilsson, P. M., Pyörälä, M., … ESC Scientific Document Group. (2024). 2024 ESC Guidelines for the management of elevated blood pressure and hypertension.</w:t>
+        <w:t xml:space="preserve">McEvoy, J. W., McCarthy, C. P., Bruno, R. M., Brouwers, S., Canavan, M., Ceconi, C., Christodorescu, R. M., D'Agostino,</w:t>
+      </w:r>
+      <w:r>
+        <w:t xml:space="preserve"> </w:t>
+      </w:r>
+      <w:r>
+        <w:t xml:space="preserve">R. B., Sr., de Simone, G., Ferro, C. J., Gevaert, S., Jordan, J., Kahan, T., Mahfoud, F., McManus, R. J., Moran, A. E.,</w:t>
+      </w:r>
+      <w:r>
+        <w:t xml:space="preserve"> </w:t>
+      </w:r>
+      <w:r>
+        <w:t xml:space="preserve">Narkiewicz, K., Nilsson, P. M., Pyörälä, M., … ESC Scientific Document Group. (2024). 2024 ESC Guidelines for the</w:t>
+      </w:r>
+      <w:r>
+        <w:t xml:space="preserve"> </w:t>
+      </w:r>
+      <w:r>
+        <w:t xml:space="preserve">management of elevated blood pressure and hypertension.</w:t>
       </w:r>
       <w:r>
         <w:t xml:space="preserve"> </w:t>
@@ -6948,7 +7622,13 @@
         <w:t xml:space="preserve">45</w:t>
       </w:r>
       <w:r>
-        <w:t xml:space="preserve">(38), 3897–3972.</w:t>
+        <w:t xml:space="preserve">(38),</w:t>
+      </w:r>
+      <w:r>
+        <w:t xml:space="preserve"> </w:t>
+      </w:r>
+      <w:r>
+        <w:t xml:space="preserve">3897–3972.</w:t>
       </w:r>
       <w:r>
         <w:t xml:space="preserve"> </w:t>
@@ -6967,7 +7647,13 @@
         <w:pStyle w:val="BodyText"/>
       </w:pPr>
       <w:r>
-        <w:t xml:space="preserve">Melby, S. J., Zierer, A., Damiano, R. J., Jr., &amp; Moon, M. R. (2013). Importance of blood pressure control after repair of acute type A aortic dissection: 25-year follow-up in 252 patients.</w:t>
+        <w:t xml:space="preserve">Melby, S. J., Zierer, A., Damiano, R. J., Jr., &amp; Moon, M. R. (2013). Importance of blood pressure control after repair</w:t>
+      </w:r>
+      <w:r>
+        <w:t xml:space="preserve"> </w:t>
+      </w:r>
+      <w:r>
+        <w:t xml:space="preserve">of acute type A aortic dissection: 25-year follow-up in 252 patients.</w:t>
       </w:r>
       <w:r>
         <w:t xml:space="preserve"> </w:t>
@@ -6993,7 +7679,13 @@
         <w:t xml:space="preserve">15</w:t>
       </w:r>
       <w:r>
-        <w:t xml:space="preserve">(1), 63–68.</w:t>
+        <w:t xml:space="preserve">(1),</w:t>
+      </w:r>
+      <w:r>
+        <w:t xml:space="preserve"> </w:t>
+      </w:r>
+      <w:r>
+        <w:t xml:space="preserve">63–68.</w:t>
       </w:r>
       <w:r>
         <w:t xml:space="preserve"> </w:t>
@@ -7012,7 +7704,13 @@
         <w:pStyle w:val="BodyText"/>
       </w:pPr>
       <w:r>
-        <w:t xml:space="preserve">Rosendaal, F. R., Cannegieter, S. C., van der Meer, F. J., &amp; Briët, E. (1993). A method to determine the optimal intensity of oral anticoagulant therapy.</w:t>
+        <w:t xml:space="preserve">Rosendaal, F. R., Cannegieter, S. C., van der Meer, F. J., &amp; Briët, E. (1993). A method to determine the optimal</w:t>
+      </w:r>
+      <w:r>
+        <w:t xml:space="preserve"> </w:t>
+      </w:r>
+      <w:r>
+        <w:t xml:space="preserve">intensity of oral anticoagulant therapy.</w:t>
       </w:r>
       <w:r>
         <w:t xml:space="preserve"> </w:t>
@@ -7038,7 +7736,13 @@
         <w:t xml:space="preserve">69</w:t>
       </w:r>
       <w:r>
-        <w:t xml:space="preserve">(3), 236–239.</w:t>
+        <w:t xml:space="preserve">(3),</w:t>
+      </w:r>
+      <w:r>
+        <w:t xml:space="preserve"> </w:t>
+      </w:r>
+      <w:r>
+        <w:t xml:space="preserve">236–239.</w:t>
       </w:r>
       <w:r>
         <w:t xml:space="preserve"> </w:t>
@@ -7057,7 +7761,19 @@
         <w:pStyle w:val="BodyText"/>
       </w:pPr>
       <w:r>
-        <w:t xml:space="preserve">Snook, J., Bhala, N., Beales, I. L. P., Cannings, D., Kightley, C., Logan, R. P. H., Pritchard, D. M., Sidhu, R., Surgenor, S., Thomas, W., Verma, A. M., &amp; Goddard, A. F. (2021). British Society of Gastroenterology guidelines for the management of iron deficiency anaemia in adults.</w:t>
+        <w:t xml:space="preserve">Snook, J., Bhala, N., Beales, I. L. P., Cannings, D., Kightley, C., Logan, R. P. H., Pritchard, D. M., Sidhu, R.,</w:t>
+      </w:r>
+      <w:r>
+        <w:t xml:space="preserve"> </w:t>
+      </w:r>
+      <w:r>
+        <w:t xml:space="preserve">Surgenor, S., Thomas, W., Verma, A. M., &amp; Goddard, A. F. (2021). British Society of Gastroenterology guidelines for the</w:t>
+      </w:r>
+      <w:r>
+        <w:t xml:space="preserve"> </w:t>
+      </w:r>
+      <w:r>
+        <w:t xml:space="preserve">management of iron deficiency anaemia in adults.</w:t>
       </w:r>
       <w:r>
         <w:t xml:space="preserve"> </w:t>
@@ -7102,7 +7818,7 @@
         <w:pStyle w:val="BodyText"/>
       </w:pPr>
       <w:r>
-        <w:t xml:space="preserve">Vahanian, A., Beyersdorf, F., Praz, F., Milojevic, M., Baldus, S., Bauersachs, J., Capodanno, D., Conradi, L., De Bonis, M., De Paulis, R., Delgado, V., Freemantle, N., Gilard, M., Haugaa, K. H., Jeppsson, A., Jüni, P., Pierard, L., Prendergast, B. D., Sádaba, J. R., … ESC/EACTS Scientific Document Group. (2022). 2021 ESC/EACTS Guidelines for the management of valvular heart disease [2].</w:t>
+        <w:t xml:space="preserve">Praz, F., Borger, M. A., Lanz, J., Marin-Cuartas, M., Abreu, A., Adamo, M., Ajmone Marsan, N., Barili, F., Bonaros, N., Cosyns, B., De Paulis, R., Gamra, H., Jahangiri, M., Jeppsson, A., Klautz, R. J. M., Mores, B., Pérez-David, E., Pöss, J., Prendergast, B. D., … Wojakowski, W. (2025). 2025 ESC/EACTS guidelines for the management of valvular heart disease.</w:t>
       </w:r>
       <w:r>
         <w:t xml:space="preserve"> </w:t>
@@ -7112,10 +7828,47 @@
           <w:i/>
           <w:iCs/>
         </w:rPr>
-        <w:t xml:space="preserve">European Heart Journal</w:t>
-      </w:r>
-      <w:r>
-        <w:t xml:space="preserve">,</w:t>
+        <w:t xml:space="preserve">European Heart Journal, 46</w:t>
+      </w:r>
+      <w:r>
+        <w:t xml:space="preserve">(44), 4635–4736.</w:t>
+      </w:r>
+      <w:r>
+        <w:t xml:space="preserve"> </w:t>
+      </w:r>
+      <w:hyperlink r:id="rId44">
+        <w:r>
+          <w:rPr>
+            <w:rStyle w:val="Hyperlink"/>
+          </w:rPr>
+          <w:t xml:space="preserve">https://doi.org/10.1093/eurheartj/ehaf194</w:t>
+        </w:r>
+      </w:hyperlink>
+    </w:p>
+    <w:p>
+      <w:pPr>
+        <w:pStyle w:val="BodyText"/>
+      </w:pPr>
+      <w:r>
+        <w:t xml:space="preserve">Vahanian, A., Beyersdorf, F., Praz, F., Milojevic, M., Baldus, S., Bauersachs, J., Capodanno, D., Conradi, L., De Bonis,</w:t>
+      </w:r>
+      <w:r>
+        <w:t xml:space="preserve"> </w:t>
+      </w:r>
+      <w:r>
+        <w:t xml:space="preserve">M., De Paulis, R., Delgado, V., Freemantle, N., Gilard, M., Haugaa, K. H., Jeppsson, A., Jüni, P., Pierard, L.,</w:t>
+      </w:r>
+      <w:r>
+        <w:t xml:space="preserve"> </w:t>
+      </w:r>
+      <w:r>
+        <w:t xml:space="preserve">Prendergast, B. D., Sádaba, J. R., … ESC/EACTS Scientific Document Group. (2022). 2021 ESC/EACTS Guidelines for the</w:t>
+      </w:r>
+      <w:r>
+        <w:t xml:space="preserve"> </w:t>
+      </w:r>
+      <w:r>
+        <w:t xml:space="preserve">management of valvular heart disease [2].</w:t>
       </w:r>
       <w:r>
         <w:t xml:space="preserve"> </w:t>
@@ -7125,15 +7878,34 @@
           <w:i/>
           <w:iCs/>
         </w:rPr>
+        <w:t xml:space="preserve">European Heart Journal</w:t>
+      </w:r>
+      <w:r>
+        <w:t xml:space="preserve">,</w:t>
+      </w:r>
+      <w:r>
+        <w:t xml:space="preserve"> </w:t>
+      </w:r>
+      <w:r>
+        <w:rPr>
+          <w:i/>
+          <w:iCs/>
+        </w:rPr>
         <w:t xml:space="preserve">43</w:t>
       </w:r>
       <w:r>
-        <w:t xml:space="preserve">(7), 561–632.</w:t>
-      </w:r>
-      <w:r>
-        <w:t xml:space="preserve"> </w:t>
-      </w:r>
-      <w:hyperlink r:id="rId44">
+        <w:t xml:space="preserve">(7),</w:t>
+      </w:r>
+      <w:r>
+        <w:t xml:space="preserve"> </w:t>
+      </w:r>
+      <w:r>
+        <w:t xml:space="preserve">561–632.</w:t>
+      </w:r>
+      <w:r>
+        <w:t xml:space="preserve"> </w:t>
+      </w:r>
+      <w:hyperlink r:id="rId45">
         <w:r>
           <w:rPr>
             <w:rStyle w:val="Hyperlink"/>
@@ -7147,7 +7919,19 @@
         <w:pStyle w:val="BodyText"/>
       </w:pPr>
       <w:r>
-        <w:t xml:space="preserve">Zhang, Q., Simoneau, G., Verstuyft, C., Drouet, L., Bal dit Sollier, C., Alvarez, J. C., Rizzo-Padoin, N., Bergmann, J. F., Becquemont, L., &amp; Mouly, S. (2011). Amoxicillin/clavulanic acid–warfarin drug interaction: A randomized controlled trial.</w:t>
+        <w:t xml:space="preserve">Zhang, Q., Simoneau, G., Verstuyft, C., Drouet, L., Bal dit Sollier, C., Alvarez, J. C., Rizzo-Padoin, N., Bergmann, J.</w:t>
+      </w:r>
+      <w:r>
+        <w:t xml:space="preserve"> </w:t>
+      </w:r>
+      <w:r>
+        <w:t xml:space="preserve">F., Becquemont, L., &amp; Mouly, S. (2011). Amoxicillin/clavulanic acid–warfarin drug interaction: A randomized controlled</w:t>
+      </w:r>
+      <w:r>
+        <w:t xml:space="preserve"> </w:t>
+      </w:r>
+      <w:r>
+        <w:t xml:space="preserve">trial.</w:t>
       </w:r>
       <w:r>
         <w:t xml:space="preserve"> </w:t>
@@ -7178,7 +7962,7 @@
       <w:r>
         <w:t xml:space="preserve"> </w:t>
       </w:r>
-      <w:hyperlink r:id="rId45">
+      <w:hyperlink r:id="rId46">
         <w:r>
           <w:rPr>
             <w:rStyle w:val="Hyperlink"/>
@@ -7194,22 +7978,13 @@
         </w:pict>
       </w:r>
     </w:p>
-    <w:bookmarkEnd w:id="46"/>
-    <w:bookmarkStart w:id="47" w:name="X9b745dbfaefc165d644a4b2d7d394f38838cfd7"/>
+    <w:bookmarkEnd w:id="47"/>
+    <w:bookmarkStart w:id="48" w:name="X9b745dbfaefc165d644a4b2d7d394f38838cfd7"/>
     <w:p>
       <w:pPr>
         <w:pStyle w:val="Heading2"/>
       </w:pPr>
       <w:r>
-        <w:rPr>
-          <w:rStyle w:val="SectionNumber"/>
-        </w:rPr>
-        <w:t xml:space="preserve">1.8</w:t>
-      </w:r>
-      <w:r>
-        <w:tab/>
-      </w:r>
-      <w:r>
         <w:t xml:space="preserve">7. Sorumluluk Reddi</w:t>
       </w:r>
     </w:p>
@@ -7218,7 +7993,19 @@
         <w:pStyle w:val="FirstParagraph"/>
       </w:pPr>
       <w:r>
-        <w:t xml:space="preserve">Bu rapor, Alaattin Sönmez'in (64E) 19 Şubat 2026 – 16 Eylül 2026 tarihleri arasındaki nesnel klinik verilerinin (2.100+ laboratuvar ölçümü, 500 kan basıncı kaydı, 178 kilo ölçümü, 67 ilaç değişikliği) uluslararası kardiyovasküler cerrahi ve hematoloji kılavuzlarıyla (ESC, ACC/AHA, EACTS/STS, BSG, KDIGO) sentezlenmesi sonucu oluşturulmuş bir</w:t>
+        <w:t xml:space="preserve">Bu rapor, Alaattin Sönmez'in (64E) 19 Şubat 2026 – 16 Eylül 2026 tarihleri arasındaki nesnel klinik verilerinin (2.100+</w:t>
+      </w:r>
+      <w:r>
+        <w:t xml:space="preserve"> </w:t>
+      </w:r>
+      <w:r>
+        <w:t xml:space="preserve">laboratuvar ölçümü, 500 kan basıncı kaydı, 180 kilo ölçümü, 67 ilaç değişikliği) uluslararası kardiyovasküler cerrahi ve</w:t>
+      </w:r>
+      <w:r>
+        <w:t xml:space="preserve"> </w:t>
+      </w:r>
+      <w:r>
+        <w:t xml:space="preserve">hematoloji kılavuzlarıyla (ESC, ACC/AHA, EACTS/STS, BSG, KDIGO) sentezlenmesi sonucu oluşturulmuş bir</w:t>
       </w:r>
       <w:r>
         <w:t xml:space="preserve"> </w:t>
@@ -7228,30 +8015,13 @@
           <w:b/>
           <w:bCs/>
         </w:rPr>
-        <w:t xml:space="preserve">cerrahi karar destek aracıdır</w:t>
-      </w:r>
-      <w:r>
-        <w:t xml:space="preserve">. Tıbbi tanı, reçete veya tedavi talimatı niteliği taşımaz. Nihai kararlar, hastayı takip eden yetkili hekim heyetine (KVC, Hematoloji, Kardiyoloji, Radyoloji, Enfeksiyon Hastalıkları) aittir.</w:t>
-      </w:r>
-    </w:p>
-    <w:p>
-      <w:pPr>
-        <w:pStyle w:val="BodyText"/>
-      </w:pPr>
+        <w:t xml:space="preserve">cerrahi karar</w:t>
+      </w:r>
       <w:r>
         <w:rPr>
           <w:b/>
           <w:bCs/>
         </w:rPr>
-        <w:t xml:space="preserve">Konsültasyon Kodu:</w:t>
-      </w:r>
-      <w:r>
-        <w:t xml:space="preserve"> </w:t>
-      </w:r>
-      <w:r>
-        <w:t xml:space="preserve">CLN-360-DSV4-20260916-208</w:t>
-      </w:r>
-      <w:r>
         <w:t xml:space="preserve"> </w:t>
       </w:r>
       <w:r>
@@ -7259,29 +8029,34 @@
           <w:b/>
           <w:bCs/>
         </w:rPr>
-        <w:t xml:space="preserve">Model:</w:t>
-      </w:r>
-      <w:r>
-        <w:t xml:space="preserve"> </w:t>
-      </w:r>
-      <w:r>
-        <w:t xml:space="preserve">DeepSeek V4 (Cerrahi Sağkalım &amp; Biyomekanik Aort Analizi)</w:t>
-      </w:r>
-      <w:r>
-        <w:t xml:space="preserve"> </w:t>
-      </w:r>
+        <w:t xml:space="preserve">destek aracıdır</w:t>
+      </w:r>
+      <w:r>
+        <w:t xml:space="preserve">. Tıbbi tanı, reçete veya tedavi talimatı niteliği taşımaz. Nihai kararlar, hastayı takip eden yetkili</w:t>
+      </w:r>
+      <w:r>
+        <w:t xml:space="preserve"> </w:t>
+      </w:r>
+      <w:r>
+        <w:t xml:space="preserve">hekim heyetine (KVC, Hematoloji, Kardiyoloji, Radyoloji, Enfeksiyon Hastalıkları) aittir.</w:t>
+      </w:r>
+    </w:p>
+    <w:p>
+      <w:pPr>
+        <w:pStyle w:val="BodyText"/>
+      </w:pPr>
       <w:r>
         <w:rPr>
           <w:b/>
           <w:bCs/>
         </w:rPr>
-        <w:t xml:space="preserve">Veri Seti:</w:t>
-      </w:r>
-      <w:r>
-        <w:t xml:space="preserve"> </w:t>
-      </w:r>
-      <w:r>
-        <w:t xml:space="preserve">2026-09-16_10-33-58_alaattin-sonmez_all-data.json</w:t>
+        <w:t xml:space="preserve">Konsültasyon Kodu:</w:t>
+      </w:r>
+      <w:r>
+        <w:t xml:space="preserve"> </w:t>
+      </w:r>
+      <w:r>
+        <w:t xml:space="preserve">CLN-360-DSV4-20260916-208</w:t>
       </w:r>
       <w:r>
         <w:t xml:space="preserve"> </w:t>
@@ -7291,17 +8066,55 @@
           <w:b/>
           <w:bCs/>
         </w:rPr>
+        <w:t xml:space="preserve">Model:</w:t>
+      </w:r>
+      <w:r>
+        <w:t xml:space="preserve"> </w:t>
+      </w:r>
+      <w:r>
+        <w:t xml:space="preserve">DeepSeek V4 (Cerrahi Sağkalım &amp; Biyomekanik Aort Analizi)</w:t>
+      </w:r>
+      <w:r>
+        <w:t xml:space="preserve"> </w:t>
+      </w:r>
+      <w:r>
+        <w:rPr>
+          <w:b/>
+          <w:bCs/>
+        </w:rPr>
+        <w:t xml:space="preserve">Veri Seti:</w:t>
+      </w:r>
+      <w:r>
+        <w:t xml:space="preserve"> </w:t>
+      </w:r>
+      <w:r>
+        <w:t xml:space="preserve">2026-09-16_10-33-58_alaattin-sonmez_all-data.json</w:t>
+      </w:r>
+      <w:r>
+        <w:t xml:space="preserve"> </w:t>
+      </w:r>
+      <w:r>
+        <w:rPr>
+          <w:b/>
+          <w:bCs/>
+        </w:rPr>
         <w:t xml:space="preserve">Postoperatif Gün:</w:t>
       </w:r>
       <w:r>
         <w:t xml:space="preserve"> </w:t>
       </w:r>
       <w:r>
-        <w:t xml:space="preserve">208 (20 Şubat 2026 Bentall Prosedürü)</w:t>
-      </w:r>
-    </w:p>
-    <w:bookmarkEnd w:id="47"/>
+        <w:t xml:space="preserve">208 (20 Şubat 2026 Bentall</w:t>
+      </w:r>
+      <w:r>
+        <w:t xml:space="preserve"> </w:t>
+      </w:r>
+      <w:r>
+        <w:t xml:space="preserve">Prosedürü)</w:t>
+      </w:r>
+    </w:p>
     <w:bookmarkEnd w:id="48"/>
+    <w:bookmarkEnd w:id="49"/>
     <w:sectPr>
       <w:footnotePr>
         <w:numRestart w:val="eachSect"/>

</xml_diff>